<commit_message>
modif individual report and add diagramm
</commit_message>
<xml_diff>
--- a/documentation/report soldat.docx
+++ b/documentation/report soldat.docx
@@ -1107,7 +1107,7 @@
         </w:rPr>
         <w:fldChar w:fldCharType="separate"/>
       </w:r>
-      <w:hyperlink w:anchor="_Toc232237338" w:history="1">
+      <w:hyperlink w:anchor="_Toc232253962" w:history="1">
         <w:r>
           <w:rPr>
             <w:rStyle w:val="a9"/>
@@ -1136,7 +1136,7 @@
             <w:noProof/>
             <w:webHidden/>
           </w:rPr>
-          <w:instrText xml:space="preserve"> PAGEREF _Toc232237338 \h </w:instrText>
+          <w:instrText xml:space="preserve"> PAGEREF _Toc232253962 \h </w:instrText>
         </w:r>
         <w:r>
           <w:rPr>
@@ -1180,7 +1180,7 @@
           <w:lang w:eastAsia="ru-RU"/>
         </w:rPr>
       </w:pPr>
-      <w:hyperlink w:anchor="_Toc232237339" w:history="1">
+      <w:hyperlink w:anchor="_Toc232253963" w:history="1">
         <w:r>
           <w:rPr>
             <w:rStyle w:val="a9"/>
@@ -1226,7 +1226,7 @@
             <w:noProof/>
             <w:webHidden/>
           </w:rPr>
-          <w:instrText xml:space="preserve"> PAGEREF _Toc232237339 \h </w:instrText>
+          <w:instrText xml:space="preserve"> PAGEREF _Toc232253963 \h </w:instrText>
         </w:r>
         <w:r>
           <w:rPr>
@@ -1270,7 +1270,7 @@
           <w:lang w:eastAsia="ru-RU"/>
         </w:rPr>
       </w:pPr>
-      <w:hyperlink w:anchor="_Toc232237340" w:history="1">
+      <w:hyperlink w:anchor="_Toc232253964" w:history="1">
         <w:r>
           <w:rPr>
             <w:rStyle w:val="a9"/>
@@ -1316,7 +1316,7 @@
             <w:noProof/>
             <w:webHidden/>
           </w:rPr>
-          <w:instrText xml:space="preserve"> PAGEREF _Toc232237340 \h </w:instrText>
+          <w:instrText xml:space="preserve"> PAGEREF _Toc232253964 \h </w:instrText>
         </w:r>
         <w:r>
           <w:rPr>
@@ -1360,7 +1360,7 @@
           <w:lang w:eastAsia="ru-RU"/>
         </w:rPr>
       </w:pPr>
-      <w:hyperlink w:anchor="_Toc232237341" w:history="1">
+      <w:hyperlink w:anchor="_Toc232253965" w:history="1">
         <w:r>
           <w:rPr>
             <w:rStyle w:val="a9"/>
@@ -1406,7 +1406,7 @@
             <w:noProof/>
             <w:webHidden/>
           </w:rPr>
-          <w:instrText xml:space="preserve"> PAGEREF _Toc232237341 \h </w:instrText>
+          <w:instrText xml:space="preserve"> PAGEREF _Toc232253965 \h </w:instrText>
         </w:r>
         <w:r>
           <w:rPr>
@@ -1450,7 +1450,7 @@
           <w:lang w:eastAsia="ru-RU"/>
         </w:rPr>
       </w:pPr>
-      <w:hyperlink w:anchor="_Toc232237342" w:history="1">
+      <w:hyperlink w:anchor="_Toc232253966" w:history="1">
         <w:r>
           <w:rPr>
             <w:rStyle w:val="a9"/>
@@ -1496,7 +1496,7 @@
             <w:noProof/>
             <w:webHidden/>
           </w:rPr>
-          <w:instrText xml:space="preserve"> PAGEREF _Toc232237342 \h </w:instrText>
+          <w:instrText xml:space="preserve"> PAGEREF _Toc232253966 \h </w:instrText>
         </w:r>
         <w:r>
           <w:rPr>
@@ -1540,7 +1540,7 @@
           <w:lang w:eastAsia="ru-RU"/>
         </w:rPr>
       </w:pPr>
-      <w:hyperlink w:anchor="_Toc232237343" w:history="1">
+      <w:hyperlink w:anchor="_Toc232253967" w:history="1">
         <w:r>
           <w:rPr>
             <w:rStyle w:val="a9"/>
@@ -1586,7 +1586,7 @@
             <w:noProof/>
             <w:webHidden/>
           </w:rPr>
-          <w:instrText xml:space="preserve"> PAGEREF _Toc232237343 \h </w:instrText>
+          <w:instrText xml:space="preserve"> PAGEREF _Toc232253967 \h </w:instrText>
         </w:r>
         <w:r>
           <w:rPr>
@@ -1630,7 +1630,7 @@
           <w:lang w:eastAsia="ru-RU"/>
         </w:rPr>
       </w:pPr>
-      <w:hyperlink w:anchor="_Toc232237344" w:history="1">
+      <w:hyperlink w:anchor="_Toc232253968" w:history="1">
         <w:r>
           <w:rPr>
             <w:rStyle w:val="a9"/>
@@ -1676,7 +1676,7 @@
             <w:noProof/>
             <w:webHidden/>
           </w:rPr>
-          <w:instrText xml:space="preserve"> PAGEREF _Toc232237344 \h </w:instrText>
+          <w:instrText xml:space="preserve"> PAGEREF _Toc232253968 \h </w:instrText>
         </w:r>
         <w:r>
           <w:rPr>
@@ -1720,7 +1720,7 @@
           <w:lang w:eastAsia="ru-RU"/>
         </w:rPr>
       </w:pPr>
-      <w:hyperlink w:anchor="_Toc232237345" w:history="1">
+      <w:hyperlink w:anchor="_Toc232253969" w:history="1">
         <w:r>
           <w:rPr>
             <w:rStyle w:val="a9"/>
@@ -1766,7 +1766,7 @@
             <w:noProof/>
             <w:webHidden/>
           </w:rPr>
-          <w:instrText xml:space="preserve"> PAGEREF _Toc232237345 \h </w:instrText>
+          <w:instrText xml:space="preserve"> PAGEREF _Toc232253969 \h </w:instrText>
         </w:r>
         <w:r>
           <w:rPr>
@@ -1801,6 +1801,7 @@
       <w:pPr>
         <w:pStyle w:val="21"/>
         <w:tabs>
+          <w:tab w:val="left" w:pos="880"/>
           <w:tab w:val="right" w:leader="dot" w:pos="9344"/>
         </w:tabs>
         <w:rPr>
@@ -1809,7 +1810,24 @@
           <w:lang w:eastAsia="ru-RU"/>
         </w:rPr>
       </w:pPr>
-      <w:hyperlink w:anchor="_Toc232237346" w:history="1">
+      <w:hyperlink w:anchor="_Toc232253970" w:history="1">
+        <w:r>
+          <w:rPr>
+            <w:rStyle w:val="a9"/>
+            <w:rFonts w:eastAsia="Times New Roman" w:cs="Times New Roman"/>
+            <w:noProof/>
+            <w:lang w:eastAsia="ru-RU"/>
+          </w:rPr>
+          <w:t>3.2.</w:t>
+        </w:r>
+        <w:r>
+          <w:rPr>
+            <w:rFonts w:eastAsiaTheme="minorEastAsia"/>
+            <w:noProof/>
+            <w:lang w:eastAsia="ru-RU"/>
+          </w:rPr>
+          <w:tab/>
+        </w:r>
         <w:r>
           <w:rPr>
             <w:rStyle w:val="a9"/>
@@ -1818,27 +1836,97 @@
             <w:noProof/>
             <w:lang w:eastAsia="ru-RU"/>
           </w:rPr>
-          <w:t>3.2. Диаграмма компонент</w:t>
-        </w:r>
+          <w:t>Диаграмма компонентов</w:t>
+        </w:r>
+        <w:r>
+          <w:rPr>
+            <w:noProof/>
+            <w:webHidden/>
+          </w:rPr>
+          <w:tab/>
+        </w:r>
+        <w:r>
+          <w:rPr>
+            <w:noProof/>
+            <w:webHidden/>
+          </w:rPr>
+          <w:fldChar w:fldCharType="begin"/>
+        </w:r>
+        <w:r>
+          <w:rPr>
+            <w:noProof/>
+            <w:webHidden/>
+          </w:rPr>
+          <w:instrText xml:space="preserve"> PAGEREF _Toc232253970 \h </w:instrText>
+        </w:r>
+        <w:r>
+          <w:rPr>
+            <w:noProof/>
+            <w:webHidden/>
+          </w:rPr>
+        </w:r>
+        <w:r>
+          <w:rPr>
+            <w:noProof/>
+            <w:webHidden/>
+          </w:rPr>
+          <w:fldChar w:fldCharType="separate"/>
+        </w:r>
+        <w:r>
+          <w:rPr>
+            <w:noProof/>
+            <w:webHidden/>
+          </w:rPr>
+          <w:t>13</w:t>
+        </w:r>
+        <w:r>
+          <w:rPr>
+            <w:noProof/>
+            <w:webHidden/>
+          </w:rPr>
+          <w:fldChar w:fldCharType="end"/>
+        </w:r>
+      </w:hyperlink>
+    </w:p>
+    <w:p>
+      <w:pPr>
+        <w:pStyle w:val="21"/>
+        <w:tabs>
+          <w:tab w:val="left" w:pos="880"/>
+          <w:tab w:val="right" w:leader="dot" w:pos="9344"/>
+        </w:tabs>
+        <w:rPr>
+          <w:rFonts w:eastAsiaTheme="minorEastAsia"/>
+          <w:noProof/>
+          <w:lang w:eastAsia="ru-RU"/>
+        </w:rPr>
+      </w:pPr>
+      <w:hyperlink w:anchor="_Toc232253971" w:history="1">
         <w:r>
           <w:rPr>
             <w:rStyle w:val="a9"/>
             <w:rFonts w:eastAsia="Times New Roman" w:cs="Times New Roman"/>
-            <w:bCs/>
             <w:noProof/>
             <w:lang w:eastAsia="ru-RU"/>
           </w:rPr>
-          <w:t>о</w:t>
+          <w:t>3.3.</w:t>
+        </w:r>
+        <w:r>
+          <w:rPr>
+            <w:rFonts w:eastAsiaTheme="minorEastAsia"/>
+            <w:noProof/>
+            <w:lang w:eastAsia="ru-RU"/>
+          </w:rPr>
+          <w:tab/>
         </w:r>
         <w:r>
           <w:rPr>
             <w:rStyle w:val="a9"/>
             <w:rFonts w:eastAsia="Times New Roman" w:cs="Times New Roman"/>
-            <w:bCs/>
             <w:noProof/>
             <w:lang w:eastAsia="ru-RU"/>
           </w:rPr>
-          <w:t>в</w:t>
+          <w:t>Диаграмма развертывания</w:t>
         </w:r>
         <w:r>
           <w:rPr>
@@ -1859,7 +1947,7 @@
             <w:noProof/>
             <w:webHidden/>
           </w:rPr>
-          <w:instrText xml:space="preserve"> PAGEREF _Toc232237346 \h </w:instrText>
+          <w:instrText xml:space="preserve"> PAGEREF _Toc232253971 \h </w:instrText>
         </w:r>
         <w:r>
           <w:rPr>
@@ -1879,7 +1967,7 @@
             <w:noProof/>
             <w:webHidden/>
           </w:rPr>
-          <w:t>13</w:t>
+          <w:t>15</w:t>
         </w:r>
         <w:r>
           <w:rPr>
@@ -1894,6 +1982,7 @@
       <w:pPr>
         <w:pStyle w:val="21"/>
         <w:tabs>
+          <w:tab w:val="left" w:pos="880"/>
           <w:tab w:val="right" w:leader="dot" w:pos="9344"/>
         </w:tabs>
         <w:rPr>
@@ -1902,25 +1991,42 @@
           <w:lang w:eastAsia="ru-RU"/>
         </w:rPr>
       </w:pPr>
-      <w:hyperlink w:anchor="_Toc232237347" w:history="1">
+      <w:hyperlink w:anchor="_Toc232253972" w:history="1">
         <w:r>
           <w:rPr>
             <w:rStyle w:val="a9"/>
-            <w:rFonts w:eastAsia="Times New Roman" w:cs="Times New Roman"/>
+            <w:rFonts w:eastAsia="Times New Roman"/>
             <w:noProof/>
             <w:lang w:eastAsia="ru-RU"/>
           </w:rPr>
-          <w:t>3.3 Диаграмма развертывания</w:t>
-        </w:r>
-        <w:r>
-          <w:rPr>
-            <w:noProof/>
-            <w:webHidden/>
+          <w:t>3.4.</w:t>
+        </w:r>
+        <w:r>
+          <w:rPr>
+            <w:rFonts w:eastAsiaTheme="minorEastAsia"/>
+            <w:noProof/>
+            <w:lang w:eastAsia="ru-RU"/>
           </w:rPr>
           <w:tab/>
         </w:r>
         <w:r>
           <w:rPr>
+            <w:rStyle w:val="a9"/>
+            <w:rFonts w:eastAsia="Times New Roman"/>
+            <w:noProof/>
+            <w:lang w:eastAsia="ru-RU"/>
+          </w:rPr>
+          <w:t>Диаграмма классов</w:t>
+        </w:r>
+        <w:r>
+          <w:rPr>
+            <w:noProof/>
+            <w:webHidden/>
+          </w:rPr>
+          <w:tab/>
+        </w:r>
+        <w:r>
+          <w:rPr>
             <w:noProof/>
             <w:webHidden/>
           </w:rPr>
@@ -1931,7 +2037,7 @@
             <w:noProof/>
             <w:webHidden/>
           </w:rPr>
-          <w:instrText xml:space="preserve"> PAGEREF _Toc232237347 \h </w:instrText>
+          <w:instrText xml:space="preserve"> PAGEREF _Toc232253972 \h </w:instrText>
         </w:r>
         <w:r>
           <w:rPr>
@@ -1951,7 +2057,835 @@
             <w:noProof/>
             <w:webHidden/>
           </w:rPr>
-          <w:t>15</w:t>
+          <w:t>16</w:t>
+        </w:r>
+        <w:r>
+          <w:rPr>
+            <w:noProof/>
+            <w:webHidden/>
+          </w:rPr>
+          <w:fldChar w:fldCharType="end"/>
+        </w:r>
+      </w:hyperlink>
+    </w:p>
+    <w:p>
+      <w:pPr>
+        <w:pStyle w:val="31"/>
+        <w:tabs>
+          <w:tab w:val="left" w:pos="1320"/>
+          <w:tab w:val="right" w:leader="dot" w:pos="9344"/>
+        </w:tabs>
+        <w:rPr>
+          <w:rFonts w:eastAsiaTheme="minorEastAsia"/>
+          <w:noProof/>
+          <w:lang w:eastAsia="ru-RU"/>
+        </w:rPr>
+      </w:pPr>
+      <w:hyperlink w:anchor="_Toc232253973" w:history="1">
+        <w:r>
+          <w:rPr>
+            <w:rStyle w:val="a9"/>
+            <w:rFonts w:eastAsia="Times New Roman"/>
+            <w:noProof/>
+            <w:lang w:eastAsia="ru-RU"/>
+          </w:rPr>
+          <w:t>3.4.1.</w:t>
+        </w:r>
+        <w:r>
+          <w:rPr>
+            <w:rFonts w:eastAsiaTheme="minorEastAsia"/>
+            <w:noProof/>
+            <w:lang w:eastAsia="ru-RU"/>
+          </w:rPr>
+          <w:tab/>
+        </w:r>
+        <w:r>
+          <w:rPr>
+            <w:rStyle w:val="a9"/>
+            <w:rFonts w:eastAsia="Times New Roman"/>
+            <w:noProof/>
+            <w:lang w:eastAsia="ru-RU"/>
+          </w:rPr>
+          <w:t>Пользователь</w:t>
+        </w:r>
+        <w:r>
+          <w:rPr>
+            <w:noProof/>
+            <w:webHidden/>
+          </w:rPr>
+          <w:tab/>
+        </w:r>
+        <w:r>
+          <w:rPr>
+            <w:noProof/>
+            <w:webHidden/>
+          </w:rPr>
+          <w:fldChar w:fldCharType="begin"/>
+        </w:r>
+        <w:r>
+          <w:rPr>
+            <w:noProof/>
+            <w:webHidden/>
+          </w:rPr>
+          <w:instrText xml:space="preserve"> PAGEREF _Toc232253973 \h </w:instrText>
+        </w:r>
+        <w:r>
+          <w:rPr>
+            <w:noProof/>
+            <w:webHidden/>
+          </w:rPr>
+        </w:r>
+        <w:r>
+          <w:rPr>
+            <w:noProof/>
+            <w:webHidden/>
+          </w:rPr>
+          <w:fldChar w:fldCharType="separate"/>
+        </w:r>
+        <w:r>
+          <w:rPr>
+            <w:noProof/>
+            <w:webHidden/>
+          </w:rPr>
+          <w:t>16</w:t>
+        </w:r>
+        <w:r>
+          <w:rPr>
+            <w:noProof/>
+            <w:webHidden/>
+          </w:rPr>
+          <w:fldChar w:fldCharType="end"/>
+        </w:r>
+      </w:hyperlink>
+    </w:p>
+    <w:p>
+      <w:pPr>
+        <w:pStyle w:val="31"/>
+        <w:tabs>
+          <w:tab w:val="left" w:pos="1320"/>
+          <w:tab w:val="right" w:leader="dot" w:pos="9344"/>
+        </w:tabs>
+        <w:rPr>
+          <w:rFonts w:eastAsiaTheme="minorEastAsia"/>
+          <w:noProof/>
+          <w:lang w:eastAsia="ru-RU"/>
+        </w:rPr>
+      </w:pPr>
+      <w:hyperlink w:anchor="_Toc232253974" w:history="1">
+        <w:r>
+          <w:rPr>
+            <w:rStyle w:val="a9"/>
+            <w:rFonts w:eastAsia="Times New Roman"/>
+            <w:noProof/>
+            <w:lang w:eastAsia="ru-RU"/>
+          </w:rPr>
+          <w:t>3.4.2.</w:t>
+        </w:r>
+        <w:r>
+          <w:rPr>
+            <w:rFonts w:eastAsiaTheme="minorEastAsia"/>
+            <w:noProof/>
+            <w:lang w:eastAsia="ru-RU"/>
+          </w:rPr>
+          <w:tab/>
+        </w:r>
+        <w:r>
+          <w:rPr>
+            <w:rStyle w:val="a9"/>
+            <w:rFonts w:eastAsia="Times New Roman"/>
+            <w:noProof/>
+            <w:lang w:eastAsia="ru-RU"/>
+          </w:rPr>
+          <w:t>Клиент</w:t>
+        </w:r>
+        <w:r>
+          <w:rPr>
+            <w:noProof/>
+            <w:webHidden/>
+          </w:rPr>
+          <w:tab/>
+        </w:r>
+        <w:r>
+          <w:rPr>
+            <w:noProof/>
+            <w:webHidden/>
+          </w:rPr>
+          <w:fldChar w:fldCharType="begin"/>
+        </w:r>
+        <w:r>
+          <w:rPr>
+            <w:noProof/>
+            <w:webHidden/>
+          </w:rPr>
+          <w:instrText xml:space="preserve"> PAGEREF _Toc232253974 \h </w:instrText>
+        </w:r>
+        <w:r>
+          <w:rPr>
+            <w:noProof/>
+            <w:webHidden/>
+          </w:rPr>
+        </w:r>
+        <w:r>
+          <w:rPr>
+            <w:noProof/>
+            <w:webHidden/>
+          </w:rPr>
+          <w:fldChar w:fldCharType="separate"/>
+        </w:r>
+        <w:r>
+          <w:rPr>
+            <w:noProof/>
+            <w:webHidden/>
+          </w:rPr>
+          <w:t>17</w:t>
+        </w:r>
+        <w:r>
+          <w:rPr>
+            <w:noProof/>
+            <w:webHidden/>
+          </w:rPr>
+          <w:fldChar w:fldCharType="end"/>
+        </w:r>
+      </w:hyperlink>
+    </w:p>
+    <w:p>
+      <w:pPr>
+        <w:pStyle w:val="31"/>
+        <w:tabs>
+          <w:tab w:val="left" w:pos="1320"/>
+          <w:tab w:val="right" w:leader="dot" w:pos="9344"/>
+        </w:tabs>
+        <w:rPr>
+          <w:rFonts w:eastAsiaTheme="minorEastAsia"/>
+          <w:noProof/>
+          <w:lang w:eastAsia="ru-RU"/>
+        </w:rPr>
+      </w:pPr>
+      <w:hyperlink w:anchor="_Toc232253975" w:history="1">
+        <w:r>
+          <w:rPr>
+            <w:rStyle w:val="a9"/>
+            <w:rFonts w:eastAsia="Times New Roman"/>
+            <w:noProof/>
+            <w:lang w:eastAsia="ru-RU"/>
+          </w:rPr>
+          <w:t>3.4.3.</w:t>
+        </w:r>
+        <w:r>
+          <w:rPr>
+            <w:rFonts w:eastAsiaTheme="minorEastAsia"/>
+            <w:noProof/>
+            <w:lang w:eastAsia="ru-RU"/>
+          </w:rPr>
+          <w:tab/>
+        </w:r>
+        <w:r>
+          <w:rPr>
+            <w:rStyle w:val="a9"/>
+            <w:rFonts w:eastAsia="Times New Roman"/>
+            <w:noProof/>
+            <w:lang w:eastAsia="ru-RU"/>
+          </w:rPr>
+          <w:t>Администратор</w:t>
+        </w:r>
+        <w:r>
+          <w:rPr>
+            <w:noProof/>
+            <w:webHidden/>
+          </w:rPr>
+          <w:tab/>
+        </w:r>
+        <w:r>
+          <w:rPr>
+            <w:noProof/>
+            <w:webHidden/>
+          </w:rPr>
+          <w:fldChar w:fldCharType="begin"/>
+        </w:r>
+        <w:r>
+          <w:rPr>
+            <w:noProof/>
+            <w:webHidden/>
+          </w:rPr>
+          <w:instrText xml:space="preserve"> PAGEREF _Toc232253975 \h </w:instrText>
+        </w:r>
+        <w:r>
+          <w:rPr>
+            <w:noProof/>
+            <w:webHidden/>
+          </w:rPr>
+        </w:r>
+        <w:r>
+          <w:rPr>
+            <w:noProof/>
+            <w:webHidden/>
+          </w:rPr>
+          <w:fldChar w:fldCharType="separate"/>
+        </w:r>
+        <w:r>
+          <w:rPr>
+            <w:noProof/>
+            <w:webHidden/>
+          </w:rPr>
+          <w:t>17</w:t>
+        </w:r>
+        <w:r>
+          <w:rPr>
+            <w:noProof/>
+            <w:webHidden/>
+          </w:rPr>
+          <w:fldChar w:fldCharType="end"/>
+        </w:r>
+      </w:hyperlink>
+    </w:p>
+    <w:p>
+      <w:pPr>
+        <w:pStyle w:val="31"/>
+        <w:tabs>
+          <w:tab w:val="left" w:pos="1320"/>
+          <w:tab w:val="right" w:leader="dot" w:pos="9344"/>
+        </w:tabs>
+        <w:rPr>
+          <w:rFonts w:eastAsiaTheme="minorEastAsia"/>
+          <w:noProof/>
+          <w:lang w:eastAsia="ru-RU"/>
+        </w:rPr>
+      </w:pPr>
+      <w:hyperlink w:anchor="_Toc232253976" w:history="1">
+        <w:r>
+          <w:rPr>
+            <w:rStyle w:val="a9"/>
+            <w:rFonts w:eastAsia="Times New Roman"/>
+            <w:noProof/>
+            <w:lang w:eastAsia="ru-RU"/>
+          </w:rPr>
+          <w:t>3.4.4.</w:t>
+        </w:r>
+        <w:r>
+          <w:rPr>
+            <w:rFonts w:eastAsiaTheme="minorEastAsia"/>
+            <w:noProof/>
+            <w:lang w:eastAsia="ru-RU"/>
+          </w:rPr>
+          <w:tab/>
+        </w:r>
+        <w:r>
+          <w:rPr>
+            <w:rStyle w:val="a9"/>
+            <w:rFonts w:eastAsia="Times New Roman"/>
+            <w:noProof/>
+            <w:lang w:eastAsia="ru-RU"/>
+          </w:rPr>
+          <w:t>Заявка</w:t>
+        </w:r>
+        <w:r>
+          <w:rPr>
+            <w:noProof/>
+            <w:webHidden/>
+          </w:rPr>
+          <w:tab/>
+        </w:r>
+        <w:r>
+          <w:rPr>
+            <w:noProof/>
+            <w:webHidden/>
+          </w:rPr>
+          <w:fldChar w:fldCharType="begin"/>
+        </w:r>
+        <w:r>
+          <w:rPr>
+            <w:noProof/>
+            <w:webHidden/>
+          </w:rPr>
+          <w:instrText xml:space="preserve"> PAGEREF _Toc232253976 \h </w:instrText>
+        </w:r>
+        <w:r>
+          <w:rPr>
+            <w:noProof/>
+            <w:webHidden/>
+          </w:rPr>
+        </w:r>
+        <w:r>
+          <w:rPr>
+            <w:noProof/>
+            <w:webHidden/>
+          </w:rPr>
+          <w:fldChar w:fldCharType="separate"/>
+        </w:r>
+        <w:r>
+          <w:rPr>
+            <w:noProof/>
+            <w:webHidden/>
+          </w:rPr>
+          <w:t>18</w:t>
+        </w:r>
+        <w:r>
+          <w:rPr>
+            <w:noProof/>
+            <w:webHidden/>
+          </w:rPr>
+          <w:fldChar w:fldCharType="end"/>
+        </w:r>
+      </w:hyperlink>
+    </w:p>
+    <w:p>
+      <w:pPr>
+        <w:pStyle w:val="31"/>
+        <w:tabs>
+          <w:tab w:val="left" w:pos="1320"/>
+          <w:tab w:val="right" w:leader="dot" w:pos="9344"/>
+        </w:tabs>
+        <w:rPr>
+          <w:rFonts w:eastAsiaTheme="minorEastAsia"/>
+          <w:noProof/>
+          <w:lang w:eastAsia="ru-RU"/>
+        </w:rPr>
+      </w:pPr>
+      <w:hyperlink w:anchor="_Toc232253977" w:history="1">
+        <w:r>
+          <w:rPr>
+            <w:rStyle w:val="a9"/>
+            <w:rFonts w:eastAsia="Times New Roman"/>
+            <w:noProof/>
+            <w:lang w:eastAsia="ru-RU"/>
+          </w:rPr>
+          <w:t>3.4.5.</w:t>
+        </w:r>
+        <w:r>
+          <w:rPr>
+            <w:rFonts w:eastAsiaTheme="minorEastAsia"/>
+            <w:noProof/>
+            <w:lang w:eastAsia="ru-RU"/>
+          </w:rPr>
+          <w:tab/>
+        </w:r>
+        <w:r>
+          <w:rPr>
+            <w:rStyle w:val="a9"/>
+            <w:rFonts w:eastAsia="Times New Roman"/>
+            <w:noProof/>
+            <w:lang w:eastAsia="ru-RU"/>
+          </w:rPr>
+          <w:t>Чаты</w:t>
+        </w:r>
+        <w:r>
+          <w:rPr>
+            <w:noProof/>
+            <w:webHidden/>
+          </w:rPr>
+          <w:tab/>
+        </w:r>
+        <w:r>
+          <w:rPr>
+            <w:noProof/>
+            <w:webHidden/>
+          </w:rPr>
+          <w:fldChar w:fldCharType="begin"/>
+        </w:r>
+        <w:r>
+          <w:rPr>
+            <w:noProof/>
+            <w:webHidden/>
+          </w:rPr>
+          <w:instrText xml:space="preserve"> PAGEREF _Toc232253977 \h </w:instrText>
+        </w:r>
+        <w:r>
+          <w:rPr>
+            <w:noProof/>
+            <w:webHidden/>
+          </w:rPr>
+        </w:r>
+        <w:r>
+          <w:rPr>
+            <w:noProof/>
+            <w:webHidden/>
+          </w:rPr>
+          <w:fldChar w:fldCharType="separate"/>
+        </w:r>
+        <w:r>
+          <w:rPr>
+            <w:noProof/>
+            <w:webHidden/>
+          </w:rPr>
+          <w:t>19</w:t>
+        </w:r>
+        <w:r>
+          <w:rPr>
+            <w:noProof/>
+            <w:webHidden/>
+          </w:rPr>
+          <w:fldChar w:fldCharType="end"/>
+        </w:r>
+      </w:hyperlink>
+    </w:p>
+    <w:p>
+      <w:pPr>
+        <w:pStyle w:val="31"/>
+        <w:tabs>
+          <w:tab w:val="left" w:pos="1320"/>
+          <w:tab w:val="right" w:leader="dot" w:pos="9344"/>
+        </w:tabs>
+        <w:rPr>
+          <w:rFonts w:eastAsiaTheme="minorEastAsia"/>
+          <w:noProof/>
+          <w:lang w:eastAsia="ru-RU"/>
+        </w:rPr>
+      </w:pPr>
+      <w:hyperlink w:anchor="_Toc232253978" w:history="1">
+        <w:r>
+          <w:rPr>
+            <w:rStyle w:val="a9"/>
+            <w:rFonts w:eastAsia="Times New Roman"/>
+            <w:noProof/>
+            <w:lang w:eastAsia="ru-RU"/>
+          </w:rPr>
+          <w:t>3.4.6.</w:t>
+        </w:r>
+        <w:r>
+          <w:rPr>
+            <w:rFonts w:eastAsiaTheme="minorEastAsia"/>
+            <w:noProof/>
+            <w:lang w:eastAsia="ru-RU"/>
+          </w:rPr>
+          <w:tab/>
+        </w:r>
+        <w:r>
+          <w:rPr>
+            <w:rStyle w:val="a9"/>
+            <w:rFonts w:eastAsia="Times New Roman"/>
+            <w:noProof/>
+            <w:lang w:eastAsia="ru-RU"/>
+          </w:rPr>
+          <w:t>Сообщения чата</w:t>
+        </w:r>
+        <w:r>
+          <w:rPr>
+            <w:noProof/>
+            <w:webHidden/>
+          </w:rPr>
+          <w:tab/>
+        </w:r>
+        <w:r>
+          <w:rPr>
+            <w:noProof/>
+            <w:webHidden/>
+          </w:rPr>
+          <w:fldChar w:fldCharType="begin"/>
+        </w:r>
+        <w:r>
+          <w:rPr>
+            <w:noProof/>
+            <w:webHidden/>
+          </w:rPr>
+          <w:instrText xml:space="preserve"> PAGEREF _Toc232253978 \h </w:instrText>
+        </w:r>
+        <w:r>
+          <w:rPr>
+            <w:noProof/>
+            <w:webHidden/>
+          </w:rPr>
+        </w:r>
+        <w:r>
+          <w:rPr>
+            <w:noProof/>
+            <w:webHidden/>
+          </w:rPr>
+          <w:fldChar w:fldCharType="separate"/>
+        </w:r>
+        <w:r>
+          <w:rPr>
+            <w:noProof/>
+            <w:webHidden/>
+          </w:rPr>
+          <w:t>19</w:t>
+        </w:r>
+        <w:r>
+          <w:rPr>
+            <w:noProof/>
+            <w:webHidden/>
+          </w:rPr>
+          <w:fldChar w:fldCharType="end"/>
+        </w:r>
+      </w:hyperlink>
+    </w:p>
+    <w:p>
+      <w:pPr>
+        <w:pStyle w:val="31"/>
+        <w:tabs>
+          <w:tab w:val="left" w:pos="1320"/>
+          <w:tab w:val="right" w:leader="dot" w:pos="9344"/>
+        </w:tabs>
+        <w:rPr>
+          <w:rFonts w:eastAsiaTheme="minorEastAsia"/>
+          <w:noProof/>
+          <w:lang w:eastAsia="ru-RU"/>
+        </w:rPr>
+      </w:pPr>
+      <w:hyperlink w:anchor="_Toc232253979" w:history="1">
+        <w:r>
+          <w:rPr>
+            <w:rStyle w:val="a9"/>
+            <w:rFonts w:eastAsia="Times New Roman"/>
+            <w:noProof/>
+            <w:lang w:eastAsia="ru-RU"/>
+          </w:rPr>
+          <w:t>3.4.7.</w:t>
+        </w:r>
+        <w:r>
+          <w:rPr>
+            <w:rFonts w:eastAsiaTheme="minorEastAsia"/>
+            <w:noProof/>
+            <w:lang w:eastAsia="ru-RU"/>
+          </w:rPr>
+          <w:tab/>
+        </w:r>
+        <w:r>
+          <w:rPr>
+            <w:rStyle w:val="a9"/>
+            <w:rFonts w:eastAsia="Times New Roman"/>
+            <w:noProof/>
+            <w:lang w:eastAsia="ru-RU"/>
+          </w:rPr>
+          <w:t>Связи между классами</w:t>
+        </w:r>
+        <w:r>
+          <w:rPr>
+            <w:noProof/>
+            <w:webHidden/>
+          </w:rPr>
+          <w:tab/>
+        </w:r>
+        <w:r>
+          <w:rPr>
+            <w:noProof/>
+            <w:webHidden/>
+          </w:rPr>
+          <w:fldChar w:fldCharType="begin"/>
+        </w:r>
+        <w:r>
+          <w:rPr>
+            <w:noProof/>
+            <w:webHidden/>
+          </w:rPr>
+          <w:instrText xml:space="preserve"> PAGEREF _Toc232253979 \h </w:instrText>
+        </w:r>
+        <w:r>
+          <w:rPr>
+            <w:noProof/>
+            <w:webHidden/>
+          </w:rPr>
+        </w:r>
+        <w:r>
+          <w:rPr>
+            <w:noProof/>
+            <w:webHidden/>
+          </w:rPr>
+          <w:fldChar w:fldCharType="separate"/>
+        </w:r>
+        <w:r>
+          <w:rPr>
+            <w:noProof/>
+            <w:webHidden/>
+          </w:rPr>
+          <w:t>19</w:t>
+        </w:r>
+        <w:r>
+          <w:rPr>
+            <w:noProof/>
+            <w:webHidden/>
+          </w:rPr>
+          <w:fldChar w:fldCharType="end"/>
+        </w:r>
+      </w:hyperlink>
+    </w:p>
+    <w:p>
+      <w:pPr>
+        <w:pStyle w:val="11"/>
+        <w:tabs>
+          <w:tab w:val="left" w:pos="440"/>
+          <w:tab w:val="right" w:leader="dot" w:pos="9344"/>
+        </w:tabs>
+        <w:rPr>
+          <w:rFonts w:eastAsiaTheme="minorEastAsia"/>
+          <w:noProof/>
+          <w:lang w:eastAsia="ru-RU"/>
+        </w:rPr>
+      </w:pPr>
+      <w:hyperlink w:anchor="_Toc232253980" w:history="1">
+        <w:r>
+          <w:rPr>
+            <w:rStyle w:val="a9"/>
+            <w:rFonts w:eastAsia="Times New Roman"/>
+            <w:noProof/>
+            <w:lang w:eastAsia="ru-RU"/>
+          </w:rPr>
+          <w:t>4.</w:t>
+        </w:r>
+        <w:r>
+          <w:rPr>
+            <w:rFonts w:eastAsiaTheme="minorEastAsia"/>
+            <w:noProof/>
+            <w:lang w:eastAsia="ru-RU"/>
+          </w:rPr>
+          <w:tab/>
+        </w:r>
+        <w:r>
+          <w:rPr>
+            <w:rStyle w:val="a9"/>
+            <w:rFonts w:eastAsia="Times New Roman"/>
+            <w:noProof/>
+            <w:lang w:eastAsia="ru-RU"/>
+          </w:rPr>
+          <w:t>Проектирование модуля «Интерфейс администратора»</w:t>
+        </w:r>
+        <w:r>
+          <w:rPr>
+            <w:noProof/>
+            <w:webHidden/>
+          </w:rPr>
+          <w:tab/>
+        </w:r>
+        <w:r>
+          <w:rPr>
+            <w:noProof/>
+            <w:webHidden/>
+          </w:rPr>
+          <w:fldChar w:fldCharType="begin"/>
+        </w:r>
+        <w:r>
+          <w:rPr>
+            <w:noProof/>
+            <w:webHidden/>
+          </w:rPr>
+          <w:instrText xml:space="preserve"> PAGEREF _Toc232253980 \h </w:instrText>
+        </w:r>
+        <w:r>
+          <w:rPr>
+            <w:noProof/>
+            <w:webHidden/>
+          </w:rPr>
+        </w:r>
+        <w:r>
+          <w:rPr>
+            <w:noProof/>
+            <w:webHidden/>
+          </w:rPr>
+          <w:fldChar w:fldCharType="separate"/>
+        </w:r>
+        <w:r>
+          <w:rPr>
+            <w:noProof/>
+            <w:webHidden/>
+          </w:rPr>
+          <w:t>22</w:t>
+        </w:r>
+        <w:r>
+          <w:rPr>
+            <w:noProof/>
+            <w:webHidden/>
+          </w:rPr>
+          <w:fldChar w:fldCharType="end"/>
+        </w:r>
+      </w:hyperlink>
+    </w:p>
+    <w:p>
+      <w:pPr>
+        <w:pStyle w:val="21"/>
+        <w:tabs>
+          <w:tab w:val="left" w:pos="880"/>
+          <w:tab w:val="right" w:leader="dot" w:pos="9344"/>
+        </w:tabs>
+        <w:rPr>
+          <w:rFonts w:eastAsiaTheme="minorEastAsia"/>
+          <w:noProof/>
+          <w:lang w:eastAsia="ru-RU"/>
+        </w:rPr>
+      </w:pPr>
+      <w:hyperlink w:anchor="_Toc232253981" w:history="1">
+        <w:r>
+          <w:rPr>
+            <w:rStyle w:val="a9"/>
+            <w:rFonts w:eastAsia="Times New Roman"/>
+            <w:noProof/>
+            <w:lang w:eastAsia="ru-RU"/>
+          </w:rPr>
+          <w:t>4.1.</w:t>
+        </w:r>
+        <w:r>
+          <w:rPr>
+            <w:rFonts w:eastAsiaTheme="minorEastAsia"/>
+            <w:noProof/>
+            <w:lang w:eastAsia="ru-RU"/>
+          </w:rPr>
+          <w:tab/>
+        </w:r>
+        <w:r>
+          <w:rPr>
+            <w:rStyle w:val="a9"/>
+            <w:rFonts w:eastAsia="Times New Roman"/>
+            <w:noProof/>
+            <w:lang w:eastAsia="ru-RU"/>
+          </w:rPr>
+          <w:t>Диаграмма деятельн</w:t>
+        </w:r>
+        <w:r>
+          <w:rPr>
+            <w:rStyle w:val="a9"/>
+            <w:rFonts w:eastAsia="Times New Roman"/>
+            <w:noProof/>
+            <w:lang w:eastAsia="ru-RU"/>
+          </w:rPr>
+          <w:t>о</w:t>
+        </w:r>
+        <w:r>
+          <w:rPr>
+            <w:rStyle w:val="a9"/>
+            <w:rFonts w:eastAsia="Times New Roman"/>
+            <w:noProof/>
+            <w:lang w:eastAsia="ru-RU"/>
+          </w:rPr>
+          <w:t>сти</w:t>
+        </w:r>
+        <w:r>
+          <w:rPr>
+            <w:noProof/>
+            <w:webHidden/>
+          </w:rPr>
+          <w:tab/>
+        </w:r>
+        <w:r>
+          <w:rPr>
+            <w:noProof/>
+            <w:webHidden/>
+          </w:rPr>
+          <w:fldChar w:fldCharType="begin"/>
+        </w:r>
+        <w:r>
+          <w:rPr>
+            <w:noProof/>
+            <w:webHidden/>
+          </w:rPr>
+          <w:instrText xml:space="preserve"> PAGEREF _Toc232253981 \h </w:instrText>
+        </w:r>
+        <w:r>
+          <w:rPr>
+            <w:noProof/>
+            <w:webHidden/>
+          </w:rPr>
+        </w:r>
+        <w:r>
+          <w:rPr>
+            <w:noProof/>
+            <w:webHidden/>
+          </w:rPr>
+          <w:fldChar w:fldCharType="separate"/>
+        </w:r>
+        <w:r>
+          <w:rPr>
+            <w:noProof/>
+            <w:webHidden/>
+          </w:rPr>
+          <w:t>22</w:t>
         </w:r>
         <w:r>
           <w:rPr>
@@ -1974,7 +2908,7 @@
           <w:lang w:eastAsia="ru-RU"/>
         </w:rPr>
       </w:pPr>
-      <w:hyperlink w:anchor="_Toc232237348" w:history="1">
+      <w:hyperlink w:anchor="_Toc232253982" w:history="1">
         <w:r>
           <w:rPr>
             <w:rStyle w:val="a9"/>
@@ -1983,7 +2917,7 @@
             <w:highlight w:val="yellow"/>
             <w:lang w:eastAsia="ru-RU"/>
           </w:rPr>
-          <w:t>Часть проектирования</w:t>
+          <w:t>Часть разработки</w:t>
         </w:r>
         <w:r>
           <w:rPr>
@@ -2004,7 +2938,7 @@
             <w:noProof/>
             <w:webHidden/>
           </w:rPr>
-          <w:instrText xml:space="preserve"> PAGEREF _Toc232237348 \h </w:instrText>
+          <w:instrText xml:space="preserve"> PAGEREF _Toc232253982 \h </w:instrText>
         </w:r>
         <w:r>
           <w:rPr>
@@ -2024,7 +2958,7 @@
             <w:noProof/>
             <w:webHidden/>
           </w:rPr>
-          <w:t>17</w:t>
+          <w:t>25</w:t>
         </w:r>
         <w:r>
           <w:rPr>
@@ -2047,7 +2981,7 @@
           <w:lang w:eastAsia="ru-RU"/>
         </w:rPr>
       </w:pPr>
-      <w:hyperlink w:anchor="_Toc232237349" w:history="1">
+      <w:hyperlink w:anchor="_Toc232253983" w:history="1">
         <w:r>
           <w:rPr>
             <w:rStyle w:val="a9"/>
@@ -2056,7 +2990,7 @@
             <w:highlight w:val="yellow"/>
             <w:lang w:eastAsia="ru-RU"/>
           </w:rPr>
-          <w:t>Часть разработки</w:t>
+          <w:t>Часть тестирования</w:t>
         </w:r>
         <w:r>
           <w:rPr>
@@ -2077,7 +3011,7 @@
             <w:noProof/>
             <w:webHidden/>
           </w:rPr>
-          <w:instrText xml:space="preserve"> PAGEREF _Toc232237349 \h </w:instrText>
+          <w:instrText xml:space="preserve"> PAGEREF _Toc232253983 \h </w:instrText>
         </w:r>
         <w:r>
           <w:rPr>
@@ -2097,7 +3031,7 @@
             <w:noProof/>
             <w:webHidden/>
           </w:rPr>
-          <w:t>18</w:t>
+          <w:t>26</w:t>
         </w:r>
         <w:r>
           <w:rPr>
@@ -2120,7 +3054,7 @@
           <w:lang w:eastAsia="ru-RU"/>
         </w:rPr>
       </w:pPr>
-      <w:hyperlink w:anchor="_Toc232237350" w:history="1">
+      <w:hyperlink w:anchor="_Toc232253984" w:history="1">
         <w:r>
           <w:rPr>
             <w:rStyle w:val="a9"/>
@@ -2129,7 +3063,7 @@
             <w:highlight w:val="yellow"/>
             <w:lang w:eastAsia="ru-RU"/>
           </w:rPr>
-          <w:t>Часть тестирования</w:t>
+          <w:t>Организация реализации проекта</w:t>
         </w:r>
         <w:r>
           <w:rPr>
@@ -2150,7 +3084,7 @@
             <w:noProof/>
             <w:webHidden/>
           </w:rPr>
-          <w:instrText xml:space="preserve"> PAGEREF _Toc232237350 \h </w:instrText>
+          <w:instrText xml:space="preserve"> PAGEREF _Toc232253984 \h </w:instrText>
         </w:r>
         <w:r>
           <w:rPr>
@@ -2170,7 +3104,7 @@
             <w:noProof/>
             <w:webHidden/>
           </w:rPr>
-          <w:t>19</w:t>
+          <w:t>27</w:t>
         </w:r>
         <w:r>
           <w:rPr>
@@ -2193,7 +3127,7 @@
           <w:lang w:eastAsia="ru-RU"/>
         </w:rPr>
       </w:pPr>
-      <w:hyperlink w:anchor="_Toc232237351" w:history="1">
+      <w:hyperlink w:anchor="_Toc232253985" w:history="1">
         <w:r>
           <w:rPr>
             <w:rStyle w:val="a9"/>
@@ -2202,7 +3136,7 @@
             <w:highlight w:val="yellow"/>
             <w:lang w:eastAsia="ru-RU"/>
           </w:rPr>
-          <w:t>Организация реализации проекта</w:t>
+          <w:t>Часть задания от предприятия</w:t>
         </w:r>
         <w:r>
           <w:rPr>
@@ -2223,7 +3157,7 @@
             <w:noProof/>
             <w:webHidden/>
           </w:rPr>
-          <w:instrText xml:space="preserve"> PAGEREF _Toc232237351 \h </w:instrText>
+          <w:instrText xml:space="preserve"> PAGEREF _Toc232253985 \h </w:instrText>
         </w:r>
         <w:r>
           <w:rPr>
@@ -2243,7 +3177,7 @@
             <w:noProof/>
             <w:webHidden/>
           </w:rPr>
-          <w:t>20</w:t>
+          <w:t>28</w:t>
         </w:r>
         <w:r>
           <w:rPr>
@@ -2266,16 +3200,15 @@
           <w:lang w:eastAsia="ru-RU"/>
         </w:rPr>
       </w:pPr>
-      <w:hyperlink w:anchor="_Toc232237352" w:history="1">
+      <w:hyperlink w:anchor="_Toc232253986" w:history="1">
         <w:r>
           <w:rPr>
             <w:rStyle w:val="a9"/>
             <w:rFonts w:eastAsia="Times New Roman"/>
             <w:noProof/>
-            <w:highlight w:val="yellow"/>
             <w:lang w:eastAsia="ru-RU"/>
           </w:rPr>
-          <w:t>Часть задания от предприятия</w:t>
+          <w:t>Заключение</w:t>
         </w:r>
         <w:r>
           <w:rPr>
@@ -2296,7 +3229,7 @@
             <w:noProof/>
             <w:webHidden/>
           </w:rPr>
-          <w:instrText xml:space="preserve"> PAGEREF _Toc232237352 \h </w:instrText>
+          <w:instrText xml:space="preserve"> PAGEREF _Toc232253986 \h </w:instrText>
         </w:r>
         <w:r>
           <w:rPr>
@@ -2316,7 +3249,7 @@
             <w:noProof/>
             <w:webHidden/>
           </w:rPr>
-          <w:t>21</w:t>
+          <w:t>29</w:t>
         </w:r>
         <w:r>
           <w:rPr>
@@ -2339,79 +3272,7 @@
           <w:lang w:eastAsia="ru-RU"/>
         </w:rPr>
       </w:pPr>
-      <w:hyperlink w:anchor="_Toc232237353" w:history="1">
-        <w:r>
-          <w:rPr>
-            <w:rStyle w:val="a9"/>
-            <w:rFonts w:eastAsia="Times New Roman"/>
-            <w:noProof/>
-            <w:lang w:eastAsia="ru-RU"/>
-          </w:rPr>
-          <w:t>Заключение</w:t>
-        </w:r>
-        <w:r>
-          <w:rPr>
-            <w:noProof/>
-            <w:webHidden/>
-          </w:rPr>
-          <w:tab/>
-        </w:r>
-        <w:r>
-          <w:rPr>
-            <w:noProof/>
-            <w:webHidden/>
-          </w:rPr>
-          <w:fldChar w:fldCharType="begin"/>
-        </w:r>
-        <w:r>
-          <w:rPr>
-            <w:noProof/>
-            <w:webHidden/>
-          </w:rPr>
-          <w:instrText xml:space="preserve"> PAGEREF _Toc232237353 \h </w:instrText>
-        </w:r>
-        <w:r>
-          <w:rPr>
-            <w:noProof/>
-            <w:webHidden/>
-          </w:rPr>
-        </w:r>
-        <w:r>
-          <w:rPr>
-            <w:noProof/>
-            <w:webHidden/>
-          </w:rPr>
-          <w:fldChar w:fldCharType="separate"/>
-        </w:r>
-        <w:r>
-          <w:rPr>
-            <w:noProof/>
-            <w:webHidden/>
-          </w:rPr>
-          <w:t>22</w:t>
-        </w:r>
-        <w:r>
-          <w:rPr>
-            <w:noProof/>
-            <w:webHidden/>
-          </w:rPr>
-          <w:fldChar w:fldCharType="end"/>
-        </w:r>
-      </w:hyperlink>
-    </w:p>
-    <w:p>
-      <w:pPr>
-        <w:pStyle w:val="11"/>
-        <w:tabs>
-          <w:tab w:val="right" w:leader="dot" w:pos="9344"/>
-        </w:tabs>
-        <w:rPr>
-          <w:rFonts w:eastAsiaTheme="minorEastAsia"/>
-          <w:noProof/>
-          <w:lang w:eastAsia="ru-RU"/>
-        </w:rPr>
-      </w:pPr>
-      <w:hyperlink w:anchor="_Toc232237354" w:history="1">
+      <w:hyperlink w:anchor="_Toc232253987" w:history="1">
         <w:r>
           <w:rPr>
             <w:rStyle w:val="a9"/>
@@ -2441,7 +3302,7 @@
             <w:noProof/>
             <w:webHidden/>
           </w:rPr>
-          <w:instrText xml:space="preserve"> PAGEREF _Toc232237354 \h </w:instrText>
+          <w:instrText xml:space="preserve"> PAGEREF _Toc232253987 \h </w:instrText>
         </w:r>
         <w:r>
           <w:rPr>
@@ -2461,7 +3322,7 @@
             <w:noProof/>
             <w:webHidden/>
           </w:rPr>
-          <w:t>23</w:t>
+          <w:t>30</w:t>
         </w:r>
         <w:r>
           <w:rPr>
@@ -2579,7 +3440,7 @@
           <w:lang w:eastAsia="ru-RU"/>
         </w:rPr>
       </w:pPr>
-      <w:bookmarkStart w:id="2" w:name="_Toc232237338"/>
+      <w:bookmarkStart w:id="2" w:name="_Toc232253962"/>
       <w:r>
         <w:rPr>
           <w:rFonts w:eastAsia="Times New Roman"/>
@@ -3624,7 +4485,7 @@
           <w:lang w:eastAsia="ru-RU"/>
         </w:rPr>
       </w:pPr>
-      <w:bookmarkStart w:id="3" w:name="_Toc232237339"/>
+      <w:bookmarkStart w:id="3" w:name="_Toc232253963"/>
       <w:r>
         <w:rPr>
           <w:rFonts w:eastAsia="Times New Roman"/>
@@ -3654,7 +4515,7 @@
           <w:lang w:eastAsia="ru-RU"/>
         </w:rPr>
       </w:pPr>
-      <w:bookmarkStart w:id="4" w:name="_Toc232237340"/>
+      <w:bookmarkStart w:id="4" w:name="_Toc232253964"/>
       <w:r>
         <w:rPr>
           <w:rFonts w:eastAsia="Times New Roman"/>
@@ -4719,7 +5580,7 @@
           <w:lang w:eastAsia="ru-RU"/>
         </w:rPr>
       </w:pPr>
-      <w:bookmarkStart w:id="5" w:name="_Toc232237341"/>
+      <w:bookmarkStart w:id="5" w:name="_Toc232253965"/>
       <w:r>
         <w:rPr>
           <w:rFonts w:eastAsia="Times New Roman"/>
@@ -5368,7 +6229,7 @@
           <w:lang w:eastAsia="ru-RU"/>
         </w:rPr>
       </w:pPr>
-      <w:bookmarkStart w:id="6" w:name="_Toc232237342"/>
+      <w:bookmarkStart w:id="6" w:name="_Toc232253966"/>
       <w:r>
         <w:rPr>
           <w:rFonts w:eastAsia="Times New Roman"/>
@@ -5517,7 +6378,7 @@
           <w:lang w:eastAsia="ru-RU"/>
         </w:rPr>
       </w:pPr>
-      <w:bookmarkStart w:id="7" w:name="_Toc232237343"/>
+      <w:bookmarkStart w:id="7" w:name="_Toc232253967"/>
       <w:r>
         <w:rPr>
           <w:rFonts w:eastAsia="Times New Roman"/>
@@ -5699,7 +6560,7 @@
           <w:lang w:eastAsia="ru-RU"/>
         </w:rPr>
       </w:pPr>
-      <w:bookmarkStart w:id="8" w:name="_Toc232237344"/>
+      <w:bookmarkStart w:id="8" w:name="_Toc232253968"/>
       <w:r>
         <w:rPr>
           <w:rFonts w:eastAsia="Times New Roman"/>
@@ -5745,7 +6606,7 @@
           <w:lang w:eastAsia="ru-RU"/>
         </w:rPr>
       </w:pPr>
-      <w:bookmarkStart w:id="9" w:name="_Toc232237345"/>
+      <w:bookmarkStart w:id="9" w:name="_Toc232253969"/>
       <w:r>
         <w:rPr>
           <w:rFonts w:eastAsia="Times New Roman"/>
@@ -7148,7 +8009,7 @@
           <w:lang w:eastAsia="ru-RU"/>
         </w:rPr>
       </w:pPr>
-      <w:bookmarkStart w:id="10" w:name="_Toc232237346"/>
+      <w:bookmarkStart w:id="10" w:name="_Toc232253970"/>
       <w:r>
         <w:rPr>
           <w:rFonts w:eastAsia="Times New Roman" w:cs="Times New Roman"/>
@@ -7888,7 +8749,7 @@
           <w:lang w:eastAsia="ru-RU"/>
         </w:rPr>
       </w:pPr>
-      <w:bookmarkStart w:id="11" w:name="_Toc232237347"/>
+      <w:bookmarkStart w:id="11" w:name="_Toc232253971"/>
       <w:r>
         <w:rPr>
           <w:rFonts w:eastAsia="Times New Roman" w:cs="Times New Roman"/>
@@ -8567,6 +9428,7 @@
           <w:lang w:eastAsia="ru-RU"/>
         </w:rPr>
       </w:pPr>
+      <w:bookmarkStart w:id="12" w:name="_Toc232253972"/>
       <w:r>
         <w:rPr>
           <w:rFonts w:eastAsia="Times New Roman"/>
@@ -8574,6 +9436,7 @@
         </w:rPr>
         <w:t>Диаграмма классов</w:t>
       </w:r>
+      <w:bookmarkEnd w:id="12"/>
     </w:p>
     <w:p>
       <w:pPr>
@@ -8620,12 +9483,21 @@
           <w:lang w:eastAsia="ru-RU"/>
         </w:rPr>
       </w:pPr>
+      <w:bookmarkStart w:id="13" w:name="_Toc232253973"/>
       <w:r>
         <w:rPr>
           <w:rFonts w:eastAsia="Times New Roman"/>
           <w:lang w:eastAsia="ru-RU"/>
         </w:rPr>
-        <w:t>Пользователь (базовый класс)</w:t>
+        <w:t>Пользователь</w:t>
+      </w:r>
+      <w:bookmarkEnd w:id="13"/>
+      <w:r>
+        <w:rPr>
+          <w:rFonts w:eastAsia="Times New Roman"/>
+          <w:lang w:eastAsia="ru-RU"/>
+        </w:rPr>
+        <w:t xml:space="preserve"> </w:t>
       </w:r>
     </w:p>
     <w:p>
@@ -9027,6 +9899,7 @@
           <w:lang w:eastAsia="ru-RU"/>
         </w:rPr>
       </w:pPr>
+      <w:bookmarkStart w:id="14" w:name="_Toc232253974"/>
       <w:r>
         <w:rPr>
           <w:rFonts w:eastAsia="Times New Roman"/>
@@ -9034,6 +9907,7 @@
         </w:rPr>
         <w:t>Клиент</w:t>
       </w:r>
+      <w:bookmarkEnd w:id="14"/>
     </w:p>
     <w:p>
       <w:pPr>
@@ -9309,6 +10183,7 @@
           <w:lang w:eastAsia="ru-RU"/>
         </w:rPr>
       </w:pPr>
+      <w:bookmarkStart w:id="15" w:name="_Toc232253975"/>
       <w:r>
         <w:rPr>
           <w:rFonts w:eastAsia="Times New Roman"/>
@@ -9316,6 +10191,7 @@
         </w:rPr>
         <w:t>Администратор</w:t>
       </w:r>
+      <w:bookmarkEnd w:id="15"/>
     </w:p>
     <w:p>
       <w:pPr>
@@ -10009,6 +10885,7 @@
           <w:lang w:eastAsia="ru-RU"/>
         </w:rPr>
       </w:pPr>
+      <w:bookmarkStart w:id="16" w:name="_Toc232253976"/>
       <w:r>
         <w:rPr>
           <w:rFonts w:eastAsia="Times New Roman"/>
@@ -10016,6 +10893,7 @@
         </w:rPr>
         <w:t>Заявка</w:t>
       </w:r>
+      <w:bookmarkEnd w:id="16"/>
     </w:p>
     <w:p>
       <w:pPr>
@@ -10172,16 +11050,7 @@
           <w:szCs w:val="28"/>
           <w:lang w:eastAsia="ru-RU"/>
         </w:rPr>
-        <w:t>Дата обновления – когда зая</w:t>
-      </w:r>
-      <w:r>
-        <w:rPr>
-          <w:rFonts w:ascii="Times New Roman" w:eastAsia="Times New Roman" w:hAnsi="Times New Roman" w:cs="Times New Roman"/>
-          <w:sz w:val="28"/>
-          <w:szCs w:val="28"/>
-          <w:lang w:eastAsia="ru-RU"/>
-        </w:rPr>
-        <w:t>вка была последний раз изменена</w:t>
+        <w:t>Дата обновления – когда заявка была последний раз изменена</w:t>
       </w:r>
     </w:p>
     <w:p>
@@ -10208,16 +11077,7 @@
           <w:szCs w:val="28"/>
           <w:lang w:eastAsia="ru-RU"/>
         </w:rPr>
-        <w:t>Исполнитель – администратор, назначенный на заявку (с</w:t>
-      </w:r>
-      <w:r>
-        <w:rPr>
-          <w:rFonts w:ascii="Times New Roman" w:eastAsia="Times New Roman" w:hAnsi="Times New Roman" w:cs="Times New Roman"/>
-          <w:sz w:val="28"/>
-          <w:szCs w:val="28"/>
-          <w:lang w:eastAsia="ru-RU"/>
-        </w:rPr>
-        <w:t>вязь с классом «Администратор»)</w:t>
+        <w:t>Исполнитель – администратор, назначенный на заявку (связь с классом «Администратор»)</w:t>
       </w:r>
     </w:p>
     <w:p>
@@ -10277,16 +11137,7 @@
           <w:szCs w:val="28"/>
           <w:lang w:eastAsia="ru-RU"/>
         </w:rPr>
-        <w:t>Со</w:t>
-      </w:r>
-      <w:r>
-        <w:rPr>
-          <w:rFonts w:ascii="Times New Roman" w:eastAsia="Times New Roman" w:hAnsi="Times New Roman" w:cs="Times New Roman"/>
-          <w:sz w:val="28"/>
-          <w:szCs w:val="28"/>
-          <w:lang w:eastAsia="ru-RU"/>
-        </w:rPr>
-        <w:t>здать(</w:t>
+        <w:t>Создать(</w:t>
       </w:r>
       <w:proofErr w:type="gramEnd"/>
       <w:r>
@@ -10324,16 +11175,7 @@
           <w:szCs w:val="28"/>
           <w:lang w:eastAsia="ru-RU"/>
         </w:rPr>
-        <w:t>Обнов</w:t>
-      </w:r>
-      <w:r>
-        <w:rPr>
-          <w:rFonts w:ascii="Times New Roman" w:eastAsia="Times New Roman" w:hAnsi="Times New Roman" w:cs="Times New Roman"/>
-          <w:sz w:val="28"/>
-          <w:szCs w:val="28"/>
-          <w:lang w:eastAsia="ru-RU"/>
-        </w:rPr>
-        <w:t>ить(</w:t>
+        <w:t>Обновить(</w:t>
       </w:r>
       <w:proofErr w:type="gramEnd"/>
       <w:r>
@@ -10380,16 +11222,7 @@
           <w:szCs w:val="28"/>
           <w:lang w:eastAsia="ru-RU"/>
         </w:rPr>
-        <w:t>заявку</w:t>
-      </w:r>
-      <w:r>
-        <w:rPr>
-          <w:rFonts w:ascii="Times New Roman" w:eastAsia="Times New Roman" w:hAnsi="Times New Roman" w:cs="Times New Roman"/>
-          <w:sz w:val="28"/>
-          <w:szCs w:val="28"/>
-          <w:lang w:eastAsia="ru-RU"/>
-        </w:rPr>
-        <w:t>(</w:t>
+        <w:t>заявку(</w:t>
       </w:r>
       <w:proofErr w:type="gramEnd"/>
       <w:r>
@@ -10436,16 +11269,7 @@
           <w:szCs w:val="28"/>
           <w:lang w:eastAsia="ru-RU"/>
         </w:rPr>
-        <w:t>врем</w:t>
-      </w:r>
-      <w:r>
-        <w:rPr>
-          <w:rFonts w:ascii="Times New Roman" w:eastAsia="Times New Roman" w:hAnsi="Times New Roman" w:cs="Times New Roman"/>
-          <w:sz w:val="28"/>
-          <w:szCs w:val="28"/>
-          <w:lang w:eastAsia="ru-RU"/>
-        </w:rPr>
-        <w:t>я(</w:t>
+        <w:t>время(</w:t>
       </w:r>
       <w:proofErr w:type="gramEnd"/>
       <w:r>
@@ -10502,16 +11326,7 @@
           <w:szCs w:val="28"/>
           <w:lang w:eastAsia="ru-RU"/>
         </w:rPr>
-        <w:t>) – г</w:t>
-      </w:r>
-      <w:r>
-        <w:rPr>
-          <w:rFonts w:ascii="Times New Roman" w:eastAsia="Times New Roman" w:hAnsi="Times New Roman" w:cs="Times New Roman"/>
-          <w:sz w:val="28"/>
-          <w:szCs w:val="28"/>
-          <w:lang w:eastAsia="ru-RU"/>
-        </w:rPr>
-        <w:t>енерация PDF-договора по заявке</w:t>
+        <w:t>) – генерация PDF-договора по заявке</w:t>
       </w:r>
     </w:p>
     <w:p>
@@ -10548,16 +11363,7 @@
           <w:szCs w:val="28"/>
           <w:lang w:eastAsia="ru-RU"/>
         </w:rPr>
-        <w:t>файл</w:t>
-      </w:r>
-      <w:r>
-        <w:rPr>
-          <w:rFonts w:ascii="Times New Roman" w:eastAsia="Times New Roman" w:hAnsi="Times New Roman" w:cs="Times New Roman"/>
-          <w:sz w:val="28"/>
-          <w:szCs w:val="28"/>
-          <w:lang w:eastAsia="ru-RU"/>
-        </w:rPr>
-        <w:t>(</w:t>
+        <w:t>файл(</w:t>
       </w:r>
       <w:proofErr w:type="gramEnd"/>
       <w:r>
@@ -10615,16 +11421,7 @@
           <w:szCs w:val="28"/>
           <w:lang w:eastAsia="ru-RU"/>
         </w:rPr>
-        <w:t>) – о</w:t>
-      </w:r>
-      <w:r>
-        <w:rPr>
-          <w:rFonts w:ascii="Times New Roman" w:eastAsia="Times New Roman" w:hAnsi="Times New Roman" w:cs="Times New Roman"/>
-          <w:sz w:val="28"/>
-          <w:szCs w:val="28"/>
-          <w:lang w:eastAsia="ru-RU"/>
-        </w:rPr>
-        <w:t>повещение клиента об изменениях</w:t>
+        <w:t>) – оповещение клиента об изменениях</w:t>
       </w:r>
     </w:p>
     <w:p>
@@ -10671,16 +11468,7 @@
           <w:szCs w:val="28"/>
           <w:lang w:eastAsia="ru-RU"/>
         </w:rPr>
-        <w:t>) – оповещени</w:t>
-      </w:r>
-      <w:r>
-        <w:rPr>
-          <w:rFonts w:ascii="Times New Roman" w:eastAsia="Times New Roman" w:hAnsi="Times New Roman" w:cs="Times New Roman"/>
-          <w:sz w:val="28"/>
-          <w:szCs w:val="28"/>
-          <w:lang w:eastAsia="ru-RU"/>
-        </w:rPr>
-        <w:t>е администратора о новой заявке</w:t>
+        <w:t>) – оповещение администратора о новой заявке</w:t>
       </w:r>
     </w:p>
     <w:p>
@@ -10696,6 +11484,7 @@
           <w:lang w:eastAsia="ru-RU"/>
         </w:rPr>
       </w:pPr>
+      <w:bookmarkStart w:id="17" w:name="_Toc232253977"/>
       <w:r>
         <w:rPr>
           <w:rFonts w:eastAsia="Times New Roman"/>
@@ -10703,6 +11492,7 @@
         </w:rPr>
         <w:t>Чаты</w:t>
       </w:r>
+      <w:bookmarkEnd w:id="17"/>
     </w:p>
     <w:p>
       <w:pPr>
@@ -10787,16 +11577,7 @@
           <w:szCs w:val="28"/>
           <w:lang w:eastAsia="ru-RU"/>
         </w:rPr>
-        <w:t>Дат</w:t>
-      </w:r>
-      <w:r>
-        <w:rPr>
-          <w:rFonts w:ascii="Times New Roman" w:eastAsia="Times New Roman" w:hAnsi="Times New Roman" w:cs="Times New Roman"/>
-          <w:sz w:val="28"/>
-          <w:szCs w:val="28"/>
-          <w:lang w:eastAsia="ru-RU"/>
-        </w:rPr>
-        <w:t>а начала – когда чат был открыт</w:t>
+        <w:t>Дата начала – когда чат был открыт</w:t>
       </w:r>
     </w:p>
     <w:p>
@@ -10823,16 +11604,7 @@
           <w:szCs w:val="28"/>
           <w:lang w:eastAsia="ru-RU"/>
         </w:rPr>
-        <w:t>Дата за</w:t>
-      </w:r>
-      <w:r>
-        <w:rPr>
-          <w:rFonts w:ascii="Times New Roman" w:eastAsia="Times New Roman" w:hAnsi="Times New Roman" w:cs="Times New Roman"/>
-          <w:sz w:val="28"/>
-          <w:szCs w:val="28"/>
-          <w:lang w:eastAsia="ru-RU"/>
-        </w:rPr>
-        <w:t>крытия – когда чат был завершён</w:t>
+        <w:t>Дата закрытия – когда чат был завершён</w:t>
       </w:r>
     </w:p>
     <w:p>
@@ -10893,16 +11665,7 @@
           <w:szCs w:val="28"/>
           <w:lang w:eastAsia="ru-RU"/>
         </w:rPr>
-        <w:t>) – откры</w:t>
-      </w:r>
-      <w:r>
-        <w:rPr>
-          <w:rFonts w:ascii="Times New Roman" w:eastAsia="Times New Roman" w:hAnsi="Times New Roman" w:cs="Times New Roman"/>
-          <w:sz w:val="28"/>
-          <w:szCs w:val="28"/>
-          <w:lang w:eastAsia="ru-RU"/>
-        </w:rPr>
-        <w:t>тие новой чат-сессии</w:t>
+        <w:t>) – открытие новой чат-сессии</w:t>
       </w:r>
     </w:p>
     <w:p>
@@ -10930,16 +11693,7 @@
           <w:szCs w:val="28"/>
           <w:lang w:eastAsia="ru-RU"/>
         </w:rPr>
-        <w:t>За</w:t>
-      </w:r>
-      <w:r>
-        <w:rPr>
-          <w:rFonts w:ascii="Times New Roman" w:eastAsia="Times New Roman" w:hAnsi="Times New Roman" w:cs="Times New Roman"/>
-          <w:sz w:val="28"/>
-          <w:szCs w:val="28"/>
-          <w:lang w:eastAsia="ru-RU"/>
-        </w:rPr>
-        <w:t>крыть(</w:t>
+        <w:t>Закрыть(</w:t>
       </w:r>
       <w:proofErr w:type="gramEnd"/>
       <w:r>
@@ -10965,6 +11719,7 @@
           <w:lang w:eastAsia="ru-RU"/>
         </w:rPr>
       </w:pPr>
+      <w:bookmarkStart w:id="18" w:name="_Toc232253978"/>
       <w:r>
         <w:rPr>
           <w:rFonts w:eastAsia="Times New Roman"/>
@@ -10972,6 +11727,7 @@
         </w:rPr>
         <w:t>Сообщения чата</w:t>
       </w:r>
+      <w:bookmarkEnd w:id="18"/>
     </w:p>
     <w:p>
       <w:pPr>
@@ -11056,16 +11812,7 @@
           <w:szCs w:val="28"/>
           <w:lang w:eastAsia="ru-RU"/>
         </w:rPr>
-        <w:t xml:space="preserve">Дата и время отправки – </w:t>
-      </w:r>
-      <w:r>
-        <w:rPr>
-          <w:rFonts w:ascii="Times New Roman" w:eastAsia="Times New Roman" w:hAnsi="Times New Roman" w:cs="Times New Roman"/>
-          <w:sz w:val="28"/>
-          <w:szCs w:val="28"/>
-          <w:lang w:eastAsia="ru-RU"/>
-        </w:rPr>
-        <w:t>когда сообщение было отправлено</w:t>
+        <w:t>Дата и время отправки – когда сообщение было отправлено</w:t>
       </w:r>
     </w:p>
     <w:p>
@@ -11092,16 +11839,7 @@
           <w:szCs w:val="28"/>
           <w:lang w:eastAsia="ru-RU"/>
         </w:rPr>
-        <w:t>Стат</w:t>
-      </w:r>
-      <w:r>
-        <w:rPr>
-          <w:rFonts w:ascii="Times New Roman" w:eastAsia="Times New Roman" w:hAnsi="Times New Roman" w:cs="Times New Roman"/>
-          <w:sz w:val="28"/>
-          <w:szCs w:val="28"/>
-          <w:lang w:eastAsia="ru-RU"/>
-        </w:rPr>
-        <w:t>ус – прочитано или не прочитано</w:t>
+        <w:t>Статус – прочитано или не прочитано</w:t>
       </w:r>
     </w:p>
     <w:p>
@@ -11152,16 +11890,7 @@
           <w:szCs w:val="28"/>
           <w:lang w:eastAsia="ru-RU"/>
         </w:rPr>
-        <w:t>О</w:t>
-      </w:r>
-      <w:r>
-        <w:rPr>
-          <w:rFonts w:ascii="Times New Roman" w:eastAsia="Times New Roman" w:hAnsi="Times New Roman" w:cs="Times New Roman"/>
-          <w:sz w:val="28"/>
-          <w:szCs w:val="28"/>
-          <w:lang w:eastAsia="ru-RU"/>
-        </w:rPr>
-        <w:t>тправить(</w:t>
+        <w:t>Отправить(</w:t>
       </w:r>
       <w:proofErr w:type="gramEnd"/>
       <w:r>
@@ -11235,6 +11964,7 @@
           <w:lang w:eastAsia="ru-RU"/>
         </w:rPr>
       </w:pPr>
+      <w:bookmarkStart w:id="19" w:name="_Toc232253979"/>
       <w:r>
         <w:rPr>
           <w:rFonts w:eastAsia="Times New Roman"/>
@@ -11242,6 +11972,7 @@
         </w:rPr>
         <w:t>Связи между классами</w:t>
       </w:r>
+      <w:bookmarkEnd w:id="19"/>
     </w:p>
     <w:p>
       <w:pPr>
@@ -11545,6 +12276,20 @@
     <w:p>
       <w:pPr>
         <w:spacing w:after="0" w:line="360" w:lineRule="auto"/>
+        <w:ind w:firstLine="709"/>
+        <w:contextualSpacing/>
+        <w:jc w:val="both"/>
+        <w:rPr>
+          <w:rFonts w:ascii="Times New Roman" w:eastAsia="Times New Roman" w:hAnsi="Times New Roman" w:cs="Times New Roman"/>
+          <w:sz w:val="28"/>
+          <w:szCs w:val="28"/>
+          <w:lang w:eastAsia="ru-RU"/>
+        </w:rPr>
+      </w:pPr>
+    </w:p>
+    <w:p>
+      <w:pPr>
+        <w:spacing w:after="0" w:line="360" w:lineRule="auto"/>
         <w:contextualSpacing/>
         <w:jc w:val="center"/>
         <w:rPr>
@@ -11562,9 +12307,9 @@
           <w:lang w:eastAsia="ru-RU"/>
         </w:rPr>
         <w:drawing>
-          <wp:inline distT="0" distB="0" distL="0" distR="0" wp14:anchorId="300986F0" wp14:editId="4C93BE86">
-            <wp:extent cx="3381153" cy="6048983"/>
-            <wp:effectExtent l="0" t="0" r="0" b="0"/>
+          <wp:inline distT="0" distB="0" distL="0" distR="0" wp14:anchorId="300986F0" wp14:editId="5835034E">
+            <wp:extent cx="3104707" cy="5554413"/>
+            <wp:effectExtent l="0" t="0" r="635" b="8255"/>
             <wp:docPr id="2" name="Рисунок 2"/>
             <wp:cNvGraphicFramePr>
               <a:graphicFrameLocks xmlns:a="http://schemas.openxmlformats.org/drawingml/2006/main" noChangeAspect="1"/>
@@ -11585,7 +12330,7 @@
                   <pic:spPr>
                     <a:xfrm>
                       <a:off x="0" y="0"/>
-                      <a:ext cx="3388759" cy="6062590"/>
+                      <a:ext cx="3116461" cy="5575441"/>
                     </a:xfrm>
                     <a:prstGeom prst="rect">
                       <a:avLst/>
@@ -11777,12 +12522,672 @@
     <w:p>
       <w:pPr>
         <w:pStyle w:val="1"/>
+        <w:numPr>
+          <w:ilvl w:val="0"/>
+          <w:numId w:val="4"/>
+        </w:numPr>
         <w:rPr>
           <w:rFonts w:eastAsia="Times New Roman"/>
           <w:lang w:eastAsia="ru-RU"/>
         </w:rPr>
       </w:pPr>
-      <w:bookmarkStart w:id="12" w:name="_Toc232237348"/>
+      <w:bookmarkStart w:id="20" w:name="_Toc232253980"/>
+      <w:r>
+        <w:rPr>
+          <w:rFonts w:eastAsia="Times New Roman"/>
+          <w:lang w:eastAsia="ru-RU"/>
+        </w:rPr>
+        <w:lastRenderedPageBreak/>
+        <w:t>Проектирование модуля «Интерфейс администратора»</w:t>
+      </w:r>
+      <w:bookmarkEnd w:id="20"/>
+    </w:p>
+    <w:p>
+      <w:pPr>
+        <w:spacing w:after="0" w:line="360" w:lineRule="auto"/>
+        <w:ind w:firstLine="709"/>
+        <w:contextualSpacing/>
+        <w:jc w:val="both"/>
+        <w:rPr>
+          <w:rFonts w:ascii="Times New Roman" w:eastAsia="Times New Roman" w:hAnsi="Times New Roman" w:cs="Times New Roman"/>
+          <w:sz w:val="28"/>
+          <w:szCs w:val="28"/>
+          <w:lang w:eastAsia="ru-RU"/>
+        </w:rPr>
+      </w:pPr>
+      <w:r>
+        <w:rPr>
+          <w:rFonts w:ascii="Times New Roman" w:eastAsia="Times New Roman" w:hAnsi="Times New Roman" w:cs="Times New Roman"/>
+          <w:sz w:val="28"/>
+          <w:szCs w:val="28"/>
+          <w:lang w:eastAsia="ru-RU"/>
+        </w:rPr>
+        <w:t xml:space="preserve">Для успешного создания модуля </w:t>
+      </w:r>
+      <w:r>
+        <w:rPr>
+          <w:rFonts w:ascii="Times New Roman" w:eastAsia="Times New Roman" w:hAnsi="Times New Roman" w:cs="Times New Roman"/>
+          <w:smallCaps/>
+          <w:sz w:val="28"/>
+          <w:szCs w:val="28"/>
+          <w:lang w:eastAsia="ru-RU"/>
+        </w:rPr>
+        <w:t>«</w:t>
+      </w:r>
+      <w:r>
+        <w:rPr>
+          <w:rFonts w:ascii="Times New Roman" w:eastAsia="Times New Roman" w:hAnsi="Times New Roman" w:cs="Times New Roman"/>
+          <w:sz w:val="28"/>
+          <w:szCs w:val="28"/>
+          <w:lang w:eastAsia="ru-RU"/>
+        </w:rPr>
+        <w:t>Интерфейс администратора» была проанализирована деятельность в этом модуле и на решение каких задач этот модуль направлен. На основе проведенного анализа были составлены 4 диаграммы для более эффективной разработки модуля.</w:t>
+      </w:r>
+    </w:p>
+    <w:p>
+      <w:pPr>
+        <w:pStyle w:val="2"/>
+        <w:numPr>
+          <w:ilvl w:val="1"/>
+          <w:numId w:val="4"/>
+        </w:numPr>
+        <w:rPr>
+          <w:rFonts w:eastAsia="Times New Roman"/>
+          <w:lang w:eastAsia="ru-RU"/>
+        </w:rPr>
+      </w:pPr>
+      <w:bookmarkStart w:id="21" w:name="_Toc232253981"/>
+      <w:r>
+        <w:rPr>
+          <w:rFonts w:eastAsia="Times New Roman"/>
+          <w:lang w:eastAsia="ru-RU"/>
+        </w:rPr>
+        <w:t>Диаграмма деятельности</w:t>
+      </w:r>
+      <w:bookmarkEnd w:id="21"/>
+    </w:p>
+    <w:p>
+      <w:pPr>
+        <w:spacing w:after="0" w:line="360" w:lineRule="auto"/>
+        <w:ind w:firstLine="709"/>
+        <w:contextualSpacing/>
+        <w:jc w:val="both"/>
+        <w:rPr>
+          <w:rFonts w:ascii="Times New Roman" w:eastAsia="Times New Roman" w:hAnsi="Times New Roman" w:cs="Times New Roman"/>
+          <w:sz w:val="28"/>
+          <w:szCs w:val="28"/>
+          <w:lang w:eastAsia="ru-RU"/>
+        </w:rPr>
+      </w:pPr>
+      <w:r>
+        <w:rPr>
+          <w:rFonts w:ascii="Times New Roman" w:eastAsia="Times New Roman" w:hAnsi="Times New Roman" w:cs="Times New Roman"/>
+          <w:sz w:val="28"/>
+          <w:szCs w:val="28"/>
+          <w:lang w:eastAsia="ru-RU"/>
+        </w:rPr>
+        <w:t>Разработанная диаграмма деятельности будет отображать взаимодействие сотрудника с заявками в системе.</w:t>
+      </w:r>
+    </w:p>
+    <w:p>
+      <w:pPr>
+        <w:spacing w:after="0" w:line="360" w:lineRule="auto"/>
+        <w:ind w:firstLine="709"/>
+        <w:contextualSpacing/>
+        <w:jc w:val="both"/>
+        <w:rPr>
+          <w:rFonts w:ascii="Times New Roman" w:eastAsia="Times New Roman" w:hAnsi="Times New Roman" w:cs="Times New Roman"/>
+          <w:sz w:val="28"/>
+          <w:szCs w:val="28"/>
+          <w:lang w:eastAsia="ru-RU"/>
+        </w:rPr>
+      </w:pPr>
+      <w:r>
+        <w:rPr>
+          <w:rFonts w:ascii="Times New Roman" w:eastAsia="Times New Roman" w:hAnsi="Times New Roman" w:cs="Times New Roman"/>
+          <w:sz w:val="28"/>
+          <w:szCs w:val="28"/>
+          <w:lang w:eastAsia="ru-RU"/>
+        </w:rPr>
+        <w:t>Начальной точкой процесса является вход администратора в систему и переход в раздел «Все заявки». Администратор выбирает подраздел для просмотра заявок в зависимости от их статуса: «Новая», «</w:t>
+      </w:r>
+      <w:r>
+        <w:rPr>
+          <w:rFonts w:ascii="Times New Roman" w:eastAsia="Times New Roman" w:hAnsi="Times New Roman" w:cs="Times New Roman"/>
+          <w:sz w:val="28"/>
+          <w:szCs w:val="28"/>
+          <w:lang w:eastAsia="ru-RU"/>
+        </w:rPr>
+        <w:t>На рассмотрении» или «Закрыта».</w:t>
+      </w:r>
+    </w:p>
+    <w:p>
+      <w:pPr>
+        <w:spacing w:after="0" w:line="360" w:lineRule="auto"/>
+        <w:ind w:firstLine="709"/>
+        <w:contextualSpacing/>
+        <w:jc w:val="both"/>
+        <w:rPr>
+          <w:rFonts w:ascii="Times New Roman" w:eastAsia="Times New Roman" w:hAnsi="Times New Roman" w:cs="Times New Roman"/>
+          <w:sz w:val="28"/>
+          <w:szCs w:val="28"/>
+          <w:lang w:eastAsia="ru-RU"/>
+        </w:rPr>
+      </w:pPr>
+      <w:r>
+        <w:rPr>
+          <w:rFonts w:ascii="Times New Roman" w:eastAsia="Times New Roman" w:hAnsi="Times New Roman" w:cs="Times New Roman"/>
+          <w:sz w:val="28"/>
+          <w:szCs w:val="28"/>
+          <w:lang w:eastAsia="ru-RU"/>
+        </w:rPr>
+        <w:t>Если выбран подраздел со статусом «Новая», устройство отображает список всех новых заявок. Администратор анализирует данные заявки, после чего назначает исполнителя. Далее система изменяет статус заявки на «На рассмотрении», и сервер отправляет уведомление пользователю о том, ч</w:t>
+      </w:r>
+      <w:r>
+        <w:rPr>
+          <w:rFonts w:ascii="Times New Roman" w:eastAsia="Times New Roman" w:hAnsi="Times New Roman" w:cs="Times New Roman"/>
+          <w:sz w:val="28"/>
+          <w:szCs w:val="28"/>
+          <w:lang w:eastAsia="ru-RU"/>
+        </w:rPr>
+        <w:t>то его заявка принята в работу.</w:t>
+      </w:r>
+    </w:p>
+    <w:p>
+      <w:pPr>
+        <w:spacing w:after="0" w:line="360" w:lineRule="auto"/>
+        <w:ind w:firstLine="709"/>
+        <w:contextualSpacing/>
+        <w:jc w:val="both"/>
+        <w:rPr>
+          <w:rFonts w:ascii="Times New Roman" w:eastAsia="Times New Roman" w:hAnsi="Times New Roman" w:cs="Times New Roman"/>
+          <w:sz w:val="28"/>
+          <w:szCs w:val="28"/>
+          <w:lang w:eastAsia="ru-RU"/>
+        </w:rPr>
+      </w:pPr>
+      <w:r>
+        <w:rPr>
+          <w:rFonts w:ascii="Times New Roman" w:eastAsia="Times New Roman" w:hAnsi="Times New Roman" w:cs="Times New Roman"/>
+          <w:sz w:val="28"/>
+          <w:szCs w:val="28"/>
+          <w:lang w:eastAsia="ru-RU"/>
+        </w:rPr>
+        <w:t>Если выбран подраздел со статусом «На рассмотрении», устройство отображает список заявок, находящихся в работе. Администратор выбирает конкретную заявку и анализирует её данные. На этом этапе возможны</w:t>
+      </w:r>
+      <w:r>
+        <w:rPr>
+          <w:rFonts w:ascii="Times New Roman" w:eastAsia="Times New Roman" w:hAnsi="Times New Roman" w:cs="Times New Roman"/>
+          <w:sz w:val="28"/>
+          <w:szCs w:val="28"/>
+          <w:lang w:eastAsia="ru-RU"/>
+        </w:rPr>
+        <w:t xml:space="preserve"> два варианта развития событий:</w:t>
+      </w:r>
+    </w:p>
+    <w:p>
+      <w:pPr>
+        <w:spacing w:after="0" w:line="360" w:lineRule="auto"/>
+        <w:ind w:firstLine="709"/>
+        <w:contextualSpacing/>
+        <w:jc w:val="both"/>
+        <w:rPr>
+          <w:rFonts w:ascii="Times New Roman" w:eastAsia="Times New Roman" w:hAnsi="Times New Roman" w:cs="Times New Roman"/>
+          <w:sz w:val="28"/>
+          <w:szCs w:val="28"/>
+          <w:lang w:eastAsia="ru-RU"/>
+        </w:rPr>
+      </w:pPr>
+      <w:r>
+        <w:rPr>
+          <w:rFonts w:ascii="Times New Roman" w:eastAsia="Times New Roman" w:hAnsi="Times New Roman" w:cs="Times New Roman"/>
+          <w:sz w:val="28"/>
+          <w:szCs w:val="28"/>
+          <w:lang w:eastAsia="ru-RU"/>
+        </w:rPr>
+        <w:t>Первый вариант: Если требуется уточнение данных, администратор добавляет комментарий к заявке с вопросом к клиенту. Устройство передаёт комментарий на сервер, сервер отправляет уведомление пользователю о новом сообщении. После этого администратор может перейти к рассмотрению друг</w:t>
+      </w:r>
+      <w:r>
+        <w:rPr>
+          <w:rFonts w:ascii="Times New Roman" w:eastAsia="Times New Roman" w:hAnsi="Times New Roman" w:cs="Times New Roman"/>
+          <w:sz w:val="28"/>
+          <w:szCs w:val="28"/>
+          <w:lang w:eastAsia="ru-RU"/>
+        </w:rPr>
+        <w:t>их заявок или завершить работу.</w:t>
+      </w:r>
+    </w:p>
+    <w:p>
+      <w:pPr>
+        <w:spacing w:after="0" w:line="360" w:lineRule="auto"/>
+        <w:ind w:firstLine="709"/>
+        <w:contextualSpacing/>
+        <w:jc w:val="both"/>
+        <w:rPr>
+          <w:rFonts w:ascii="Times New Roman" w:eastAsia="Times New Roman" w:hAnsi="Times New Roman" w:cs="Times New Roman"/>
+          <w:sz w:val="28"/>
+          <w:szCs w:val="28"/>
+          <w:lang w:eastAsia="ru-RU"/>
+        </w:rPr>
+      </w:pPr>
+      <w:r>
+        <w:rPr>
+          <w:rFonts w:ascii="Times New Roman" w:eastAsia="Times New Roman" w:hAnsi="Times New Roman" w:cs="Times New Roman"/>
+          <w:sz w:val="28"/>
+          <w:szCs w:val="28"/>
+          <w:lang w:eastAsia="ru-RU"/>
+        </w:rPr>
+        <w:t xml:space="preserve">Второй вариант: Если уточнение данных не требуется, администратор назначает время приёма в офисе. Устройство передаёт данные на сервер, </w:t>
+      </w:r>
+      <w:r>
+        <w:rPr>
+          <w:rFonts w:ascii="Times New Roman" w:eastAsia="Times New Roman" w:hAnsi="Times New Roman" w:cs="Times New Roman"/>
+          <w:sz w:val="28"/>
+          <w:szCs w:val="28"/>
+          <w:lang w:eastAsia="ru-RU"/>
+        </w:rPr>
+        <w:lastRenderedPageBreak/>
+        <w:t>сервер изменяет статус заявки на «Закрыта» и отправляет уведомление пользователю о назначенном времени приёма. После этого администратор может перейти к рассмотрению друг</w:t>
+      </w:r>
+      <w:r>
+        <w:rPr>
+          <w:rFonts w:ascii="Times New Roman" w:eastAsia="Times New Roman" w:hAnsi="Times New Roman" w:cs="Times New Roman"/>
+          <w:sz w:val="28"/>
+          <w:szCs w:val="28"/>
+          <w:lang w:eastAsia="ru-RU"/>
+        </w:rPr>
+        <w:t>их заявок или завершить работу.</w:t>
+      </w:r>
+    </w:p>
+    <w:p>
+      <w:pPr>
+        <w:spacing w:after="0" w:line="360" w:lineRule="auto"/>
+        <w:ind w:firstLine="709"/>
+        <w:contextualSpacing/>
+        <w:jc w:val="both"/>
+        <w:rPr>
+          <w:rFonts w:ascii="Times New Roman" w:eastAsia="Times New Roman" w:hAnsi="Times New Roman" w:cs="Times New Roman"/>
+          <w:sz w:val="28"/>
+          <w:szCs w:val="28"/>
+          <w:lang w:eastAsia="ru-RU"/>
+        </w:rPr>
+      </w:pPr>
+      <w:r>
+        <w:rPr>
+          <w:rFonts w:ascii="Times New Roman" w:eastAsia="Times New Roman" w:hAnsi="Times New Roman" w:cs="Times New Roman"/>
+          <w:sz w:val="28"/>
+          <w:szCs w:val="28"/>
+          <w:lang w:eastAsia="ru-RU"/>
+        </w:rPr>
+        <w:t>Если выбран подраздел со статусом «Закрыта», устройство отображает список закрытых заявок. Администратор может просмотреть данные любой закрытой заявки. При необходимости администратор может выбрать функцию скачивания договора. Если функция выбрана, устройство генерирует и скачивает PDF-договор по данной заявке. Если функция не выбрана, администратор возвраща</w:t>
+      </w:r>
+      <w:r>
+        <w:rPr>
+          <w:rFonts w:ascii="Times New Roman" w:eastAsia="Times New Roman" w:hAnsi="Times New Roman" w:cs="Times New Roman"/>
+          <w:sz w:val="28"/>
+          <w:szCs w:val="28"/>
+          <w:lang w:eastAsia="ru-RU"/>
+        </w:rPr>
+        <w:t>ется к просмотру списка заявок.</w:t>
+      </w:r>
+    </w:p>
+    <w:p>
+      <w:pPr>
+        <w:spacing w:after="0" w:line="360" w:lineRule="auto"/>
+        <w:ind w:firstLine="709"/>
+        <w:contextualSpacing/>
+        <w:jc w:val="both"/>
+        <w:rPr>
+          <w:rFonts w:ascii="Times New Roman" w:eastAsia="Times New Roman" w:hAnsi="Times New Roman" w:cs="Times New Roman"/>
+          <w:sz w:val="28"/>
+          <w:szCs w:val="28"/>
+          <w:lang w:eastAsia="ru-RU"/>
+        </w:rPr>
+      </w:pPr>
+      <w:r>
+        <w:rPr>
+          <w:rFonts w:ascii="Times New Roman" w:eastAsia="Times New Roman" w:hAnsi="Times New Roman" w:cs="Times New Roman"/>
+          <w:sz w:val="28"/>
+          <w:szCs w:val="28"/>
+          <w:lang w:eastAsia="ru-RU"/>
+        </w:rPr>
+        <w:t>После завершения обработки заявки администратору предлагается рассмотреть другие заявки. Если рассмотрение других заявок требуется, администратор возвращается к выбору подраздела со статусами заявок. Если рассмотрение других заявок не требуется, процесс завершается, и ад</w:t>
+      </w:r>
+      <w:r>
+        <w:rPr>
+          <w:rFonts w:ascii="Times New Roman" w:eastAsia="Times New Roman" w:hAnsi="Times New Roman" w:cs="Times New Roman"/>
+          <w:sz w:val="28"/>
+          <w:szCs w:val="28"/>
+          <w:lang w:eastAsia="ru-RU"/>
+        </w:rPr>
+        <w:t>министратор выходит из системы.</w:t>
+      </w:r>
+    </w:p>
+    <w:p>
+      <w:pPr>
+        <w:spacing w:after="0" w:line="360" w:lineRule="auto"/>
+        <w:ind w:firstLine="709"/>
+        <w:contextualSpacing/>
+        <w:jc w:val="both"/>
+        <w:rPr>
+          <w:rFonts w:ascii="Times New Roman" w:eastAsia="Times New Roman" w:hAnsi="Times New Roman" w:cs="Times New Roman"/>
+          <w:sz w:val="28"/>
+          <w:szCs w:val="28"/>
+          <w:lang w:eastAsia="ru-RU"/>
+        </w:rPr>
+      </w:pPr>
+      <w:r>
+        <w:rPr>
+          <w:rFonts w:ascii="Times New Roman" w:eastAsia="Times New Roman" w:hAnsi="Times New Roman" w:cs="Times New Roman"/>
+          <w:sz w:val="28"/>
+          <w:szCs w:val="28"/>
+          <w:lang w:eastAsia="ru-RU"/>
+        </w:rPr>
+        <w:t>Завершающей точкой диаграммы является окончание процесса работы администратора. При успешной обработке всех заявок администратор завершает сеанс работы. При возникновении необходимости продолжить работу администратор остаётся в системе и может перейти к рассмотрению следующих заявок.</w:t>
+      </w:r>
+    </w:p>
+    <w:p>
+      <w:pPr>
+        <w:spacing w:after="0" w:line="360" w:lineRule="auto"/>
+        <w:contextualSpacing/>
+        <w:jc w:val="center"/>
+        <w:rPr>
+          <w:rFonts w:ascii="Times New Roman" w:eastAsia="Times New Roman" w:hAnsi="Times New Roman" w:cs="Times New Roman"/>
+          <w:sz w:val="28"/>
+          <w:szCs w:val="28"/>
+          <w:lang w:eastAsia="ru-RU"/>
+        </w:rPr>
+      </w:pPr>
+      <w:r>
+        <w:rPr>
+          <w:rFonts w:ascii="Times New Roman" w:eastAsia="Times New Roman" w:hAnsi="Times New Roman" w:cs="Times New Roman"/>
+          <w:sz w:val="28"/>
+          <w:szCs w:val="28"/>
+          <w:lang w:eastAsia="ru-RU"/>
+        </w:rPr>
+        <w:lastRenderedPageBreak/>
+        <w:drawing>
+          <wp:inline distT="0" distB="0" distL="0" distR="0" wp14:anchorId="7E1B34C6" wp14:editId="7E689BAC">
+            <wp:extent cx="5939790" cy="6210935"/>
+            <wp:effectExtent l="0" t="0" r="3810" b="0"/>
+            <wp:docPr id="3" name="Рисунок 3"/>
+            <wp:cNvGraphicFramePr>
+              <a:graphicFrameLocks xmlns:a="http://schemas.openxmlformats.org/drawingml/2006/main" noChangeAspect="1"/>
+            </wp:cNvGraphicFramePr>
+            <a:graphic xmlns:a="http://schemas.openxmlformats.org/drawingml/2006/main">
+              <a:graphicData uri="http://schemas.openxmlformats.org/drawingml/2006/picture">
+                <pic:pic xmlns:pic="http://schemas.openxmlformats.org/drawingml/2006/picture">
+                  <pic:nvPicPr>
+                    <pic:cNvPr id="1" name=""/>
+                    <pic:cNvPicPr/>
+                  </pic:nvPicPr>
+                  <pic:blipFill>
+                    <a:blip r:embed="rId12"/>
+                    <a:stretch>
+                      <a:fillRect/>
+                    </a:stretch>
+                  </pic:blipFill>
+                  <pic:spPr>
+                    <a:xfrm>
+                      <a:off x="0" y="0"/>
+                      <a:ext cx="5939790" cy="6210935"/>
+                    </a:xfrm>
+                    <a:prstGeom prst="rect">
+                      <a:avLst/>
+                    </a:prstGeom>
+                  </pic:spPr>
+                </pic:pic>
+              </a:graphicData>
+            </a:graphic>
+          </wp:inline>
+        </w:drawing>
+      </w:r>
+    </w:p>
+    <w:p>
+      <w:pPr>
+        <w:spacing w:after="0" w:line="360" w:lineRule="auto"/>
+        <w:contextualSpacing/>
+        <w:jc w:val="center"/>
+        <w:rPr>
+          <w:rFonts w:ascii="Times New Roman" w:eastAsia="Times New Roman" w:hAnsi="Times New Roman" w:cs="Times New Roman"/>
+          <w:sz w:val="28"/>
+          <w:szCs w:val="28"/>
+          <w:lang w:eastAsia="ru-RU"/>
+        </w:rPr>
+      </w:pPr>
+      <w:r>
+        <w:rPr>
+          <w:rFonts w:ascii="Times New Roman" w:eastAsia="Times New Roman" w:hAnsi="Times New Roman" w:cs="Times New Roman"/>
+          <w:sz w:val="28"/>
+          <w:szCs w:val="28"/>
+          <w:lang w:eastAsia="ru-RU"/>
+        </w:rPr>
+        <w:t>Рисунок 5 – Диаграмма деятельности.</w:t>
+      </w:r>
+    </w:p>
+    <w:p>
+      <w:pPr>
+        <w:pStyle w:val="2"/>
+        <w:numPr>
+          <w:ilvl w:val="1"/>
+          <w:numId w:val="4"/>
+        </w:numPr>
+        <w:rPr>
+          <w:rFonts w:eastAsia="Times New Roman"/>
+          <w:lang w:eastAsia="ru-RU"/>
+        </w:rPr>
+      </w:pPr>
+      <w:r>
+        <w:rPr>
+          <w:rFonts w:eastAsia="Times New Roman"/>
+          <w:lang w:eastAsia="ru-RU"/>
+        </w:rPr>
+        <w:t>Диаграмма последовательности</w:t>
+      </w:r>
+    </w:p>
+    <w:p>
+      <w:pPr>
+        <w:spacing w:after="0" w:line="360" w:lineRule="auto"/>
+        <w:ind w:firstLine="709"/>
+        <w:contextualSpacing/>
+        <w:jc w:val="both"/>
+        <w:rPr>
+          <w:rFonts w:ascii="Times New Roman" w:eastAsia="Times New Roman" w:hAnsi="Times New Roman" w:cs="Times New Roman"/>
+          <w:sz w:val="28"/>
+          <w:szCs w:val="28"/>
+          <w:lang w:eastAsia="ru-RU"/>
+        </w:rPr>
+      </w:pPr>
+      <w:r>
+        <w:rPr>
+          <w:rFonts w:ascii="Times New Roman" w:eastAsia="Times New Roman" w:hAnsi="Times New Roman" w:cs="Times New Roman"/>
+          <w:sz w:val="28"/>
+          <w:szCs w:val="28"/>
+          <w:lang w:eastAsia="ru-RU"/>
+        </w:rPr>
+        <w:t xml:space="preserve">Для полного понимания данного модуля </w:t>
+      </w:r>
+      <w:r>
+        <w:rPr>
+          <w:rFonts w:ascii="Times New Roman" w:eastAsia="Times New Roman" w:hAnsi="Times New Roman" w:cs="Times New Roman"/>
+          <w:sz w:val="28"/>
+          <w:szCs w:val="28"/>
+          <w:lang w:eastAsia="ru-RU"/>
+        </w:rPr>
+        <w:t>построена диаграмма последовательности для другого инструмента в данном модуле, а именно для инструмента для взаимодействия с данными пользователей (изменение, обновление, удаление, создание данных пользователей).</w:t>
+      </w:r>
+      <w:bookmarkStart w:id="22" w:name="_GoBack"/>
+      <w:bookmarkEnd w:id="22"/>
+    </w:p>
+    <w:p>
+      <w:pPr>
+        <w:spacing w:after="0" w:line="360" w:lineRule="auto"/>
+        <w:ind w:firstLine="709"/>
+        <w:contextualSpacing/>
+        <w:jc w:val="both"/>
+        <w:rPr>
+          <w:rFonts w:ascii="Times New Roman" w:eastAsia="Times New Roman" w:hAnsi="Times New Roman" w:cs="Times New Roman"/>
+          <w:sz w:val="28"/>
+          <w:szCs w:val="28"/>
+          <w:lang w:eastAsia="ru-RU"/>
+        </w:rPr>
+      </w:pPr>
+    </w:p>
+    <w:p>
+      <w:pPr>
+        <w:spacing w:after="0" w:line="360" w:lineRule="auto"/>
+        <w:ind w:firstLine="709"/>
+        <w:contextualSpacing/>
+        <w:jc w:val="both"/>
+        <w:rPr>
+          <w:rFonts w:ascii="Times New Roman" w:eastAsia="Times New Roman" w:hAnsi="Times New Roman" w:cs="Times New Roman"/>
+          <w:sz w:val="28"/>
+          <w:szCs w:val="28"/>
+          <w:lang w:eastAsia="ru-RU"/>
+        </w:rPr>
+      </w:pPr>
+    </w:p>
+    <w:p>
+      <w:pPr>
+        <w:spacing w:after="0" w:line="360" w:lineRule="auto"/>
+        <w:ind w:firstLine="709"/>
+        <w:contextualSpacing/>
+        <w:jc w:val="both"/>
+        <w:rPr>
+          <w:rFonts w:ascii="Times New Roman" w:eastAsia="Times New Roman" w:hAnsi="Times New Roman" w:cs="Times New Roman"/>
+          <w:sz w:val="28"/>
+          <w:szCs w:val="28"/>
+          <w:lang w:eastAsia="ru-RU"/>
+        </w:rPr>
+      </w:pPr>
+    </w:p>
+    <w:p>
+      <w:pPr>
+        <w:spacing w:after="0" w:line="360" w:lineRule="auto"/>
+        <w:ind w:firstLine="709"/>
+        <w:contextualSpacing/>
+        <w:jc w:val="both"/>
+        <w:rPr>
+          <w:rFonts w:ascii="Times New Roman" w:eastAsia="Times New Roman" w:hAnsi="Times New Roman" w:cs="Times New Roman"/>
+          <w:sz w:val="28"/>
+          <w:szCs w:val="28"/>
+          <w:lang w:eastAsia="ru-RU"/>
+        </w:rPr>
+      </w:pPr>
+    </w:p>
+    <w:p>
+      <w:pPr>
+        <w:spacing w:after="0" w:line="360" w:lineRule="auto"/>
+        <w:ind w:firstLine="709"/>
+        <w:contextualSpacing/>
+        <w:jc w:val="both"/>
+        <w:rPr>
+          <w:rFonts w:ascii="Times New Roman" w:eastAsia="Times New Roman" w:hAnsi="Times New Roman" w:cs="Times New Roman"/>
+          <w:sz w:val="28"/>
+          <w:szCs w:val="28"/>
+          <w:lang w:eastAsia="ru-RU"/>
+        </w:rPr>
+      </w:pPr>
+    </w:p>
+    <w:p>
+      <w:pPr>
+        <w:spacing w:after="0" w:line="360" w:lineRule="auto"/>
+        <w:ind w:firstLine="709"/>
+        <w:contextualSpacing/>
+        <w:jc w:val="both"/>
+        <w:rPr>
+          <w:rFonts w:ascii="Times New Roman" w:eastAsia="Times New Roman" w:hAnsi="Times New Roman" w:cs="Times New Roman"/>
+          <w:sz w:val="28"/>
+          <w:szCs w:val="28"/>
+          <w:lang w:eastAsia="ru-RU"/>
+        </w:rPr>
+      </w:pPr>
+    </w:p>
+    <w:p>
+      <w:pPr>
+        <w:spacing w:after="0" w:line="360" w:lineRule="auto"/>
+        <w:ind w:firstLine="709"/>
+        <w:contextualSpacing/>
+        <w:jc w:val="both"/>
+        <w:rPr>
+          <w:rFonts w:ascii="Times New Roman" w:eastAsia="Times New Roman" w:hAnsi="Times New Roman" w:cs="Times New Roman"/>
+          <w:sz w:val="28"/>
+          <w:szCs w:val="28"/>
+          <w:lang w:eastAsia="ru-RU"/>
+        </w:rPr>
+      </w:pPr>
+    </w:p>
+    <w:p>
+      <w:pPr>
+        <w:spacing w:after="0" w:line="360" w:lineRule="auto"/>
+        <w:ind w:firstLine="709"/>
+        <w:contextualSpacing/>
+        <w:jc w:val="both"/>
+        <w:rPr>
+          <w:rFonts w:ascii="Times New Roman" w:eastAsia="Times New Roman" w:hAnsi="Times New Roman" w:cs="Times New Roman"/>
+          <w:sz w:val="28"/>
+          <w:szCs w:val="28"/>
+          <w:lang w:eastAsia="ru-RU"/>
+        </w:rPr>
+      </w:pPr>
+    </w:p>
+    <w:p>
+      <w:pPr>
+        <w:spacing w:after="0" w:line="360" w:lineRule="auto"/>
+        <w:ind w:firstLine="709"/>
+        <w:contextualSpacing/>
+        <w:jc w:val="both"/>
+        <w:rPr>
+          <w:rFonts w:ascii="Times New Roman" w:eastAsia="Times New Roman" w:hAnsi="Times New Roman" w:cs="Times New Roman"/>
+          <w:sz w:val="28"/>
+          <w:szCs w:val="28"/>
+          <w:lang w:eastAsia="ru-RU"/>
+        </w:rPr>
+      </w:pPr>
+    </w:p>
+    <w:p>
+      <w:pPr>
+        <w:spacing w:after="0" w:line="360" w:lineRule="auto"/>
+        <w:ind w:firstLine="709"/>
+        <w:contextualSpacing/>
+        <w:jc w:val="both"/>
+        <w:rPr>
+          <w:rFonts w:ascii="Times New Roman" w:eastAsia="Times New Roman" w:hAnsi="Times New Roman" w:cs="Times New Roman"/>
+          <w:sz w:val="28"/>
+          <w:szCs w:val="28"/>
+          <w:lang w:eastAsia="ru-RU"/>
+        </w:rPr>
+      </w:pPr>
+    </w:p>
+    <w:p>
+      <w:pPr>
+        <w:spacing w:after="160" w:line="259" w:lineRule="auto"/>
+        <w:rPr>
+          <w:rFonts w:ascii="Times New Roman" w:eastAsia="Times New Roman" w:hAnsi="Times New Roman" w:cs="Times New Roman"/>
+          <w:sz w:val="28"/>
+          <w:szCs w:val="28"/>
+          <w:lang w:eastAsia="ru-RU"/>
+        </w:rPr>
+      </w:pPr>
+      <w:r>
+        <w:rPr>
+          <w:rFonts w:ascii="Times New Roman" w:eastAsia="Times New Roman" w:hAnsi="Times New Roman" w:cs="Times New Roman"/>
+          <w:sz w:val="28"/>
+          <w:szCs w:val="28"/>
+          <w:lang w:eastAsia="ru-RU"/>
+        </w:rPr>
+        <w:br w:type="page"/>
+      </w:r>
+    </w:p>
+    <w:p>
+      <w:pPr>
+        <w:pStyle w:val="1"/>
+        <w:rPr>
+          <w:rFonts w:eastAsia="Times New Roman"/>
+          <w:lang w:eastAsia="ru-RU"/>
+        </w:rPr>
+      </w:pPr>
+      <w:bookmarkStart w:id="23" w:name="_Toc232253982"/>
       <w:r>
         <w:rPr>
           <w:rFonts w:eastAsia="Times New Roman"/>
@@ -11790,9 +13195,9 @@
           <w:lang w:eastAsia="ru-RU"/>
         </w:rPr>
         <w:lastRenderedPageBreak/>
-        <w:t>Часть проектирования</w:t>
-      </w:r>
-      <w:bookmarkEnd w:id="12"/>
+        <w:t>Часть разработки</w:t>
+      </w:r>
+      <w:bookmarkEnd w:id="23"/>
     </w:p>
     <w:p>
       <w:pPr>
@@ -11824,6 +13229,46 @@
     </w:p>
     <w:p>
       <w:pPr>
+        <w:spacing w:after="160" w:line="259" w:lineRule="auto"/>
+        <w:rPr>
+          <w:rFonts w:ascii="Times New Roman" w:eastAsia="Times New Roman" w:hAnsi="Times New Roman" w:cs="Times New Roman"/>
+          <w:sz w:val="28"/>
+          <w:szCs w:val="28"/>
+          <w:lang w:eastAsia="ru-RU"/>
+        </w:rPr>
+      </w:pPr>
+      <w:r>
+        <w:rPr>
+          <w:rFonts w:ascii="Times New Roman" w:eastAsia="Times New Roman" w:hAnsi="Times New Roman" w:cs="Times New Roman"/>
+          <w:sz w:val="28"/>
+          <w:szCs w:val="28"/>
+          <w:lang w:eastAsia="ru-RU"/>
+        </w:rPr>
+        <w:br w:type="page"/>
+      </w:r>
+    </w:p>
+    <w:p>
+      <w:pPr>
+        <w:pStyle w:val="1"/>
+        <w:rPr>
+          <w:rFonts w:eastAsia="Times New Roman"/>
+          <w:lang w:eastAsia="ru-RU"/>
+        </w:rPr>
+      </w:pPr>
+      <w:bookmarkStart w:id="24" w:name="_Toc232253983"/>
+      <w:r>
+        <w:rPr>
+          <w:rFonts w:eastAsia="Times New Roman"/>
+          <w:highlight w:val="yellow"/>
+          <w:lang w:eastAsia="ru-RU"/>
+        </w:rPr>
+        <w:lastRenderedPageBreak/>
+        <w:t>Часть тестирования</w:t>
+      </w:r>
+      <w:bookmarkEnd w:id="24"/>
+    </w:p>
+    <w:p>
+      <w:pPr>
         <w:spacing w:after="0" w:line="360" w:lineRule="auto"/>
         <w:ind w:firstLine="709"/>
         <w:contextualSpacing/>
@@ -11849,8 +13294,6 @@
           <w:lang w:eastAsia="ru-RU"/>
         </w:rPr>
       </w:pPr>
-      <w:bookmarkStart w:id="13" w:name="_GoBack"/>
-      <w:bookmarkEnd w:id="13"/>
     </w:p>
     <w:p>
       <w:pPr>
@@ -11880,7 +13323,7 @@
           <w:lang w:eastAsia="ru-RU"/>
         </w:rPr>
       </w:pPr>
-      <w:bookmarkStart w:id="14" w:name="_Toc232237349"/>
+      <w:bookmarkStart w:id="25" w:name="_Toc232253984"/>
       <w:r>
         <w:rPr>
           <w:rFonts w:eastAsia="Times New Roman"/>
@@ -11888,9 +13331,9 @@
           <w:lang w:eastAsia="ru-RU"/>
         </w:rPr>
         <w:lastRenderedPageBreak/>
-        <w:t>Часть разработки</w:t>
-      </w:r>
-      <w:bookmarkEnd w:id="14"/>
+        <w:t>Организация реализации проекта</w:t>
+      </w:r>
+      <w:bookmarkEnd w:id="25"/>
     </w:p>
     <w:p>
       <w:pPr>
@@ -11948,7 +13391,7 @@
           <w:lang w:eastAsia="ru-RU"/>
         </w:rPr>
       </w:pPr>
-      <w:bookmarkStart w:id="15" w:name="_Toc232237350"/>
+      <w:bookmarkStart w:id="26" w:name="_Toc232253985"/>
       <w:r>
         <w:rPr>
           <w:rFonts w:eastAsia="Times New Roman"/>
@@ -11956,9 +13399,9 @@
           <w:lang w:eastAsia="ru-RU"/>
         </w:rPr>
         <w:lastRenderedPageBreak/>
-        <w:t>Часть тестирования</w:t>
-      </w:r>
-      <w:bookmarkEnd w:id="15"/>
+        <w:t>Часть задания от предприятия</w:t>
+      </w:r>
+      <w:bookmarkEnd w:id="26"/>
     </w:p>
     <w:p>
       <w:pPr>
@@ -12016,143 +13459,7 @@
           <w:lang w:eastAsia="ru-RU"/>
         </w:rPr>
       </w:pPr>
-      <w:bookmarkStart w:id="16" w:name="_Toc232237351"/>
-      <w:r>
-        <w:rPr>
-          <w:rFonts w:eastAsia="Times New Roman"/>
-          <w:highlight w:val="yellow"/>
-          <w:lang w:eastAsia="ru-RU"/>
-        </w:rPr>
-        <w:lastRenderedPageBreak/>
-        <w:t>Организация реализации проекта</w:t>
-      </w:r>
-      <w:bookmarkEnd w:id="16"/>
-    </w:p>
-    <w:p>
-      <w:pPr>
-        <w:spacing w:after="0" w:line="360" w:lineRule="auto"/>
-        <w:ind w:firstLine="709"/>
-        <w:contextualSpacing/>
-        <w:jc w:val="both"/>
-        <w:rPr>
-          <w:rFonts w:ascii="Times New Roman" w:eastAsia="Times New Roman" w:hAnsi="Times New Roman" w:cs="Times New Roman"/>
-          <w:sz w:val="28"/>
-          <w:szCs w:val="28"/>
-          <w:lang w:eastAsia="ru-RU"/>
-        </w:rPr>
-      </w:pPr>
-    </w:p>
-    <w:p>
-      <w:pPr>
-        <w:spacing w:after="0" w:line="360" w:lineRule="auto"/>
-        <w:ind w:firstLine="709"/>
-        <w:contextualSpacing/>
-        <w:jc w:val="both"/>
-        <w:rPr>
-          <w:rFonts w:ascii="Times New Roman" w:eastAsia="Times New Roman" w:hAnsi="Times New Roman" w:cs="Times New Roman"/>
-          <w:sz w:val="28"/>
-          <w:szCs w:val="28"/>
-          <w:lang w:eastAsia="ru-RU"/>
-        </w:rPr>
-      </w:pPr>
-    </w:p>
-    <w:p>
-      <w:pPr>
-        <w:spacing w:after="160" w:line="259" w:lineRule="auto"/>
-        <w:rPr>
-          <w:rFonts w:ascii="Times New Roman" w:eastAsia="Times New Roman" w:hAnsi="Times New Roman" w:cs="Times New Roman"/>
-          <w:sz w:val="28"/>
-          <w:szCs w:val="28"/>
-          <w:lang w:eastAsia="ru-RU"/>
-        </w:rPr>
-      </w:pPr>
-      <w:r>
-        <w:rPr>
-          <w:rFonts w:ascii="Times New Roman" w:eastAsia="Times New Roman" w:hAnsi="Times New Roman" w:cs="Times New Roman"/>
-          <w:sz w:val="28"/>
-          <w:szCs w:val="28"/>
-          <w:lang w:eastAsia="ru-RU"/>
-        </w:rPr>
-        <w:br w:type="page"/>
-      </w:r>
-    </w:p>
-    <w:p>
-      <w:pPr>
-        <w:pStyle w:val="1"/>
-        <w:rPr>
-          <w:rFonts w:eastAsia="Times New Roman"/>
-          <w:lang w:eastAsia="ru-RU"/>
-        </w:rPr>
-      </w:pPr>
-      <w:bookmarkStart w:id="17" w:name="_Toc232237352"/>
-      <w:r>
-        <w:rPr>
-          <w:rFonts w:eastAsia="Times New Roman"/>
-          <w:highlight w:val="yellow"/>
-          <w:lang w:eastAsia="ru-RU"/>
-        </w:rPr>
-        <w:lastRenderedPageBreak/>
-        <w:t>Часть задания от предприятия</w:t>
-      </w:r>
-      <w:bookmarkEnd w:id="17"/>
-    </w:p>
-    <w:p>
-      <w:pPr>
-        <w:spacing w:after="0" w:line="360" w:lineRule="auto"/>
-        <w:ind w:firstLine="709"/>
-        <w:contextualSpacing/>
-        <w:jc w:val="both"/>
-        <w:rPr>
-          <w:rFonts w:ascii="Times New Roman" w:eastAsia="Times New Roman" w:hAnsi="Times New Roman" w:cs="Times New Roman"/>
-          <w:sz w:val="28"/>
-          <w:szCs w:val="28"/>
-          <w:lang w:eastAsia="ru-RU"/>
-        </w:rPr>
-      </w:pPr>
-    </w:p>
-    <w:p>
-      <w:pPr>
-        <w:spacing w:after="0" w:line="360" w:lineRule="auto"/>
-        <w:ind w:firstLine="709"/>
-        <w:contextualSpacing/>
-        <w:jc w:val="both"/>
-        <w:rPr>
-          <w:rFonts w:ascii="Times New Roman" w:eastAsia="Times New Roman" w:hAnsi="Times New Roman" w:cs="Times New Roman"/>
-          <w:sz w:val="28"/>
-          <w:szCs w:val="28"/>
-          <w:lang w:eastAsia="ru-RU"/>
-        </w:rPr>
-      </w:pPr>
-    </w:p>
-    <w:p>
-      <w:pPr>
-        <w:spacing w:after="160" w:line="259" w:lineRule="auto"/>
-        <w:rPr>
-          <w:rFonts w:ascii="Times New Roman" w:eastAsia="Times New Roman" w:hAnsi="Times New Roman" w:cs="Times New Roman"/>
-          <w:sz w:val="28"/>
-          <w:szCs w:val="28"/>
-          <w:lang w:eastAsia="ru-RU"/>
-        </w:rPr>
-      </w:pPr>
-      <w:r>
-        <w:rPr>
-          <w:rFonts w:ascii="Times New Roman" w:eastAsia="Times New Roman" w:hAnsi="Times New Roman" w:cs="Times New Roman"/>
-          <w:sz w:val="28"/>
-          <w:szCs w:val="28"/>
-          <w:lang w:eastAsia="ru-RU"/>
-        </w:rPr>
-        <w:br w:type="page"/>
-      </w:r>
-    </w:p>
-    <w:p>
-      <w:pPr>
-        <w:pStyle w:val="1"/>
-        <w:rPr>
-          <w:rFonts w:eastAsia="Times New Roman"/>
-          <w:lang w:eastAsia="ru-RU"/>
-        </w:rPr>
-      </w:pPr>
-      <w:bookmarkStart w:id="18" w:name="_Toc232237353"/>
+      <w:bookmarkStart w:id="27" w:name="_Toc232253986"/>
       <w:r>
         <w:rPr>
           <w:rFonts w:eastAsia="Times New Roman"/>
@@ -12161,7 +13468,7 @@
         <w:lastRenderedPageBreak/>
         <w:t>Заключение</w:t>
       </w:r>
-      <w:bookmarkEnd w:id="18"/>
+      <w:bookmarkEnd w:id="27"/>
     </w:p>
     <w:p>
       <w:pPr>
@@ -12259,7 +13566,7 @@
           <w:lang w:eastAsia="ru-RU"/>
         </w:rPr>
       </w:pPr>
-      <w:bookmarkStart w:id="19" w:name="_Toc232237354"/>
+      <w:bookmarkStart w:id="28" w:name="_Toc232253987"/>
       <w:r>
         <w:rPr>
           <w:rFonts w:eastAsia="Times New Roman"/>
@@ -12271,7 +13578,7 @@
         <w:lastRenderedPageBreak/>
         <w:t>Приложение А.</w:t>
       </w:r>
-      <w:bookmarkEnd w:id="19"/>
+      <w:bookmarkEnd w:id="28"/>
     </w:p>
     <w:p>
       <w:pPr>
@@ -12302,7 +13609,7 @@
       </w:pPr>
     </w:p>
     <w:sectPr>
-      <w:footerReference w:type="default" r:id="rId12"/>
+      <w:footerReference w:type="default" r:id="rId13"/>
       <w:pgSz w:w="11906" w:h="16838"/>
       <w:pgMar w:top="1134" w:right="851" w:bottom="1134" w:left="1701" w:header="709" w:footer="709" w:gutter="0"/>
       <w:pgNumType w:start="0"/>
@@ -12349,7 +13656,6 @@
         <w:docPartUnique/>
       </w:docPartObj>
     </w:sdtPr>
-    <w:sdtEndPr/>
     <w:sdtContent>
       <w:p>
         <w:pPr>
@@ -12369,7 +13675,7 @@
           <w:rPr>
             <w:noProof/>
           </w:rPr>
-          <w:t>25</w:t>
+          <w:t>24</w:t>
         </w:r>
         <w:r>
           <w:fldChar w:fldCharType="end"/>
@@ -16699,7 +18005,7 @@
 </file>
 
 <file path=customXml/itemProps1.xml><?xml version="1.0" encoding="utf-8"?>
-<ds:datastoreItem xmlns:ds="http://schemas.openxmlformats.org/officeDocument/2006/customXml" ds:itemID="{CF4B007E-A63C-4BD1-B92D-4AB4A6723B31}">
+<ds:datastoreItem xmlns:ds="http://schemas.openxmlformats.org/officeDocument/2006/customXml" ds:itemID="{8B00DCA8-79F4-4921-8754-8F3E47136A8E}">
   <ds:schemaRefs>
     <ds:schemaRef ds:uri="http://schemas.openxmlformats.org/officeDocument/2006/bibliography"/>
   </ds:schemaRefs>

</xml_diff>

<commit_message>
add new diagram and modif individ report
</commit_message>
<xml_diff>
--- a/documentation/report soldat.docx
+++ b/documentation/report soldat.docx
@@ -12995,7 +12995,7 @@
           <w:rFonts w:ascii="Times New Roman" w:eastAsia="Times New Roman" w:hAnsi="Times New Roman" w:cs="Times New Roman"/>
           <w:sz w:val="28"/>
           <w:szCs w:val="28"/>
-          <w:lang w:eastAsia="ru-RU"/>
+          <w:lang w:val="en-US" w:eastAsia="ru-RU"/>
         </w:rPr>
       </w:pPr>
       <w:r>
@@ -13016,50 +13016,562 @@
         </w:rPr>
         <w:t>построена диаграмма последовательности для другого инструмента в данном модуле, а именно для инструмента для взаимодействия с данными пользователей (изменение, обновление, удаление, создание данных пользователей).</w:t>
       </w:r>
+    </w:p>
+    <w:p>
+      <w:pPr>
+        <w:spacing w:after="0" w:line="360" w:lineRule="auto"/>
+        <w:ind w:firstLine="709"/>
+        <w:contextualSpacing/>
+        <w:jc w:val="both"/>
+        <w:rPr>
+          <w:rFonts w:ascii="Times New Roman" w:eastAsia="Times New Roman" w:hAnsi="Times New Roman" w:cs="Times New Roman"/>
+          <w:sz w:val="28"/>
+          <w:szCs w:val="28"/>
+          <w:lang w:eastAsia="ru-RU"/>
+        </w:rPr>
+      </w:pPr>
+      <w:r>
+        <w:rPr>
+          <w:rFonts w:ascii="Times New Roman" w:eastAsia="Times New Roman" w:hAnsi="Times New Roman" w:cs="Times New Roman"/>
+          <w:sz w:val="28"/>
+          <w:szCs w:val="28"/>
+          <w:lang w:eastAsia="ru-RU"/>
+        </w:rPr>
+        <w:t>Всего три дорожки:</w:t>
+      </w:r>
+    </w:p>
+    <w:p>
+      <w:pPr>
+        <w:spacing w:after="0" w:line="360" w:lineRule="auto"/>
+        <w:ind w:firstLine="709"/>
+        <w:contextualSpacing/>
+        <w:jc w:val="both"/>
+        <w:rPr>
+          <w:rFonts w:ascii="Times New Roman" w:eastAsia="Times New Roman" w:hAnsi="Times New Roman" w:cs="Times New Roman"/>
+          <w:sz w:val="28"/>
+          <w:szCs w:val="28"/>
+          <w:lang w:eastAsia="ru-RU"/>
+        </w:rPr>
+      </w:pPr>
+      <w:r>
+        <w:rPr>
+          <w:rFonts w:ascii="Times New Roman" w:eastAsia="Times New Roman" w:hAnsi="Times New Roman" w:cs="Times New Roman"/>
+          <w:sz w:val="28"/>
+          <w:szCs w:val="28"/>
+          <w:lang w:eastAsia="ru-RU"/>
+        </w:rPr>
+        <w:t xml:space="preserve">Администратор – описывает действия администратора при взаимодействии с интерфейсом системы. Администратор вводит логин и </w:t>
+      </w:r>
+      <w:r>
+        <w:rPr>
+          <w:rFonts w:ascii="Times New Roman" w:eastAsia="Times New Roman" w:hAnsi="Times New Roman" w:cs="Times New Roman"/>
+          <w:sz w:val="28"/>
+          <w:szCs w:val="28"/>
+          <w:lang w:eastAsia="ru-RU"/>
+        </w:rPr>
+        <w:lastRenderedPageBreak/>
+        <w:t>пароль для входа, выбирает раздел управления пользователями, выбирает пользователя для редактирования, вводит новые д</w:t>
+      </w:r>
+      <w:r>
+        <w:rPr>
+          <w:rFonts w:ascii="Times New Roman" w:eastAsia="Times New Roman" w:hAnsi="Times New Roman" w:cs="Times New Roman"/>
+          <w:sz w:val="28"/>
+          <w:szCs w:val="28"/>
+          <w:lang w:eastAsia="ru-RU"/>
+        </w:rPr>
+        <w:t>анные и подтверждает изменения.</w:t>
+      </w:r>
+    </w:p>
+    <w:p>
+      <w:pPr>
+        <w:spacing w:after="0" w:line="360" w:lineRule="auto"/>
+        <w:ind w:firstLine="709"/>
+        <w:contextualSpacing/>
+        <w:jc w:val="both"/>
+        <w:rPr>
+          <w:rFonts w:ascii="Times New Roman" w:eastAsia="Times New Roman" w:hAnsi="Times New Roman" w:cs="Times New Roman"/>
+          <w:sz w:val="28"/>
+          <w:szCs w:val="28"/>
+          <w:lang w:eastAsia="ru-RU"/>
+        </w:rPr>
+      </w:pPr>
+      <w:r>
+        <w:rPr>
+          <w:rFonts w:ascii="Times New Roman" w:eastAsia="Times New Roman" w:hAnsi="Times New Roman" w:cs="Times New Roman"/>
+          <w:sz w:val="28"/>
+          <w:szCs w:val="28"/>
+          <w:lang w:eastAsia="ru-RU"/>
+        </w:rPr>
+        <w:t>Интерфейс системы – отражает визуальную логику работы приложения. Интерфейс отображает формы ввода, выводит панель администратора, отображает список пользователей, выводит данные выбранного пользователя, а также передаёт данн</w:t>
+      </w:r>
+      <w:r>
+        <w:rPr>
+          <w:rFonts w:ascii="Times New Roman" w:eastAsia="Times New Roman" w:hAnsi="Times New Roman" w:cs="Times New Roman"/>
+          <w:sz w:val="28"/>
+          <w:szCs w:val="28"/>
+          <w:lang w:eastAsia="ru-RU"/>
+        </w:rPr>
+        <w:t>ые на сервер и получает ответы.</w:t>
+      </w:r>
+    </w:p>
+    <w:p>
+      <w:pPr>
+        <w:spacing w:after="0" w:line="360" w:lineRule="auto"/>
+        <w:ind w:firstLine="709"/>
+        <w:contextualSpacing/>
+        <w:jc w:val="both"/>
+        <w:rPr>
+          <w:rFonts w:ascii="Times New Roman" w:eastAsia="Times New Roman" w:hAnsi="Times New Roman" w:cs="Times New Roman"/>
+          <w:sz w:val="28"/>
+          <w:szCs w:val="28"/>
+          <w:lang w:eastAsia="ru-RU"/>
+        </w:rPr>
+      </w:pPr>
+      <w:r>
+        <w:rPr>
+          <w:rFonts w:ascii="Times New Roman" w:eastAsia="Times New Roman" w:hAnsi="Times New Roman" w:cs="Times New Roman"/>
+          <w:sz w:val="28"/>
+          <w:szCs w:val="28"/>
+          <w:lang w:eastAsia="ru-RU"/>
+        </w:rPr>
+        <w:t>Сервер БД – используется для хранения учётных записей пользователей и выполняет внутреннюю логику системы: проверку существования аккаунта при входе, проверку корректности данных при регистрации, получение списка пользователей, получение данных выбранного пользов</w:t>
+      </w:r>
+      <w:r>
+        <w:rPr>
+          <w:rFonts w:ascii="Times New Roman" w:eastAsia="Times New Roman" w:hAnsi="Times New Roman" w:cs="Times New Roman"/>
+          <w:sz w:val="28"/>
+          <w:szCs w:val="28"/>
+          <w:lang w:eastAsia="ru-RU"/>
+        </w:rPr>
+        <w:t>ателя, обновление данных.</w:t>
+      </w:r>
+    </w:p>
+    <w:p>
+      <w:pPr>
+        <w:spacing w:after="0" w:line="360" w:lineRule="auto"/>
+        <w:ind w:firstLine="709"/>
+        <w:contextualSpacing/>
+        <w:jc w:val="both"/>
+        <w:rPr>
+          <w:rFonts w:ascii="Times New Roman" w:eastAsia="Times New Roman" w:hAnsi="Times New Roman" w:cs="Times New Roman"/>
+          <w:sz w:val="28"/>
+          <w:szCs w:val="28"/>
+          <w:lang w:eastAsia="ru-RU"/>
+        </w:rPr>
+      </w:pPr>
+      <w:r>
+        <w:rPr>
+          <w:rFonts w:ascii="Times New Roman" w:eastAsia="Times New Roman" w:hAnsi="Times New Roman" w:cs="Times New Roman"/>
+          <w:sz w:val="28"/>
+          <w:szCs w:val="28"/>
+          <w:lang w:eastAsia="ru-RU"/>
+        </w:rPr>
+        <w:t>Описание:</w:t>
+      </w:r>
+    </w:p>
+    <w:p>
+      <w:pPr>
+        <w:spacing w:after="0" w:line="360" w:lineRule="auto"/>
+        <w:ind w:firstLine="709"/>
+        <w:contextualSpacing/>
+        <w:jc w:val="both"/>
+        <w:rPr>
+          <w:rFonts w:ascii="Times New Roman" w:eastAsia="Times New Roman" w:hAnsi="Times New Roman" w:cs="Times New Roman"/>
+          <w:sz w:val="28"/>
+          <w:szCs w:val="28"/>
+          <w:lang w:eastAsia="ru-RU"/>
+        </w:rPr>
+      </w:pPr>
+      <w:r>
+        <w:rPr>
+          <w:rFonts w:ascii="Times New Roman" w:eastAsia="Times New Roman" w:hAnsi="Times New Roman" w:cs="Times New Roman"/>
+          <w:sz w:val="28"/>
+          <w:szCs w:val="28"/>
+          <w:lang w:eastAsia="ru-RU"/>
+        </w:rPr>
+        <w:t>Администратор вводит логин и пароль и подтверждает вход. Интерфейс системы передаёт введённые данные на Сервер БД. Сервер БД выполняет проверку существования аккаунта и проверку</w:t>
+      </w:r>
+      <w:r>
+        <w:rPr>
+          <w:rFonts w:ascii="Times New Roman" w:eastAsia="Times New Roman" w:hAnsi="Times New Roman" w:cs="Times New Roman"/>
+          <w:sz w:val="28"/>
+          <w:szCs w:val="28"/>
+          <w:lang w:eastAsia="ru-RU"/>
+        </w:rPr>
+        <w:t xml:space="preserve"> корректности данных для входа.</w:t>
+      </w:r>
+    </w:p>
+    <w:p>
+      <w:pPr>
+        <w:spacing w:after="0" w:line="360" w:lineRule="auto"/>
+        <w:ind w:firstLine="709"/>
+        <w:contextualSpacing/>
+        <w:jc w:val="both"/>
+        <w:rPr>
+          <w:rFonts w:ascii="Times New Roman" w:eastAsia="Times New Roman" w:hAnsi="Times New Roman" w:cs="Times New Roman"/>
+          <w:sz w:val="28"/>
+          <w:szCs w:val="28"/>
+          <w:lang w:eastAsia="ru-RU"/>
+        </w:rPr>
+      </w:pPr>
+      <w:r>
+        <w:rPr>
+          <w:rFonts w:ascii="Times New Roman" w:eastAsia="Times New Roman" w:hAnsi="Times New Roman" w:cs="Times New Roman"/>
+          <w:sz w:val="28"/>
+          <w:szCs w:val="28"/>
+          <w:lang w:eastAsia="ru-RU"/>
+        </w:rPr>
+        <w:t>Если аккаунт не существует или данные для входа не верны, сервер возвращает ошибку, интерфейс выводит сообщение об ошибке и запрещает доступ. Администратор возвра</w:t>
+      </w:r>
+      <w:r>
+        <w:rPr>
+          <w:rFonts w:ascii="Times New Roman" w:eastAsia="Times New Roman" w:hAnsi="Times New Roman" w:cs="Times New Roman"/>
+          <w:sz w:val="28"/>
+          <w:szCs w:val="28"/>
+          <w:lang w:eastAsia="ru-RU"/>
+        </w:rPr>
+        <w:t>щается к вводу логина и пароля.</w:t>
+      </w:r>
+    </w:p>
+    <w:p>
+      <w:pPr>
+        <w:spacing w:after="0" w:line="360" w:lineRule="auto"/>
+        <w:ind w:firstLine="709"/>
+        <w:contextualSpacing/>
+        <w:jc w:val="both"/>
+        <w:rPr>
+          <w:rFonts w:ascii="Times New Roman" w:eastAsia="Times New Roman" w:hAnsi="Times New Roman" w:cs="Times New Roman"/>
+          <w:sz w:val="28"/>
+          <w:szCs w:val="28"/>
+          <w:lang w:eastAsia="ru-RU"/>
+        </w:rPr>
+      </w:pPr>
+      <w:r>
+        <w:rPr>
+          <w:rFonts w:ascii="Times New Roman" w:eastAsia="Times New Roman" w:hAnsi="Times New Roman" w:cs="Times New Roman"/>
+          <w:sz w:val="28"/>
+          <w:szCs w:val="28"/>
+          <w:lang w:eastAsia="ru-RU"/>
+        </w:rPr>
+        <w:t>Если аккаунт найден и данные для входа совпали, сервер подтверждает успешную авторизацию, и интерфейс от</w:t>
+      </w:r>
+      <w:r>
+        <w:rPr>
+          <w:rFonts w:ascii="Times New Roman" w:eastAsia="Times New Roman" w:hAnsi="Times New Roman" w:cs="Times New Roman"/>
+          <w:sz w:val="28"/>
+          <w:szCs w:val="28"/>
+          <w:lang w:eastAsia="ru-RU"/>
+        </w:rPr>
+        <w:t>ображает панель администратора.</w:t>
+      </w:r>
+    </w:p>
+    <w:p>
+      <w:pPr>
+        <w:spacing w:after="0" w:line="360" w:lineRule="auto"/>
+        <w:ind w:firstLine="709"/>
+        <w:contextualSpacing/>
+        <w:jc w:val="both"/>
+        <w:rPr>
+          <w:rFonts w:ascii="Times New Roman" w:eastAsia="Times New Roman" w:hAnsi="Times New Roman" w:cs="Times New Roman"/>
+          <w:sz w:val="28"/>
+          <w:szCs w:val="28"/>
+          <w:lang w:eastAsia="ru-RU"/>
+        </w:rPr>
+      </w:pPr>
+      <w:r>
+        <w:rPr>
+          <w:rFonts w:ascii="Times New Roman" w:eastAsia="Times New Roman" w:hAnsi="Times New Roman" w:cs="Times New Roman"/>
+          <w:sz w:val="28"/>
+          <w:szCs w:val="28"/>
+          <w:lang w:eastAsia="ru-RU"/>
+        </w:rPr>
+        <w:t>Администратор выбирает раздел «Управление пользователями». Интерфейс запрашивает у сервера список пользователей, сервер возвращает данные, и интерфейс отображает список пользовател</w:t>
+      </w:r>
+      <w:r>
+        <w:rPr>
+          <w:rFonts w:ascii="Times New Roman" w:eastAsia="Times New Roman" w:hAnsi="Times New Roman" w:cs="Times New Roman"/>
+          <w:sz w:val="28"/>
+          <w:szCs w:val="28"/>
+          <w:lang w:eastAsia="ru-RU"/>
+        </w:rPr>
+        <w:t>ей.</w:t>
+      </w:r>
+    </w:p>
+    <w:p>
+      <w:pPr>
+        <w:spacing w:after="0" w:line="360" w:lineRule="auto"/>
+        <w:ind w:firstLine="709"/>
+        <w:contextualSpacing/>
+        <w:jc w:val="both"/>
+        <w:rPr>
+          <w:rFonts w:ascii="Times New Roman" w:eastAsia="Times New Roman" w:hAnsi="Times New Roman" w:cs="Times New Roman"/>
+          <w:sz w:val="28"/>
+          <w:szCs w:val="28"/>
+          <w:lang w:eastAsia="ru-RU"/>
+        </w:rPr>
+      </w:pPr>
+      <w:r>
+        <w:rPr>
+          <w:rFonts w:ascii="Times New Roman" w:eastAsia="Times New Roman" w:hAnsi="Times New Roman" w:cs="Times New Roman"/>
+          <w:sz w:val="28"/>
+          <w:szCs w:val="28"/>
+          <w:lang w:eastAsia="ru-RU"/>
+        </w:rPr>
+        <w:t>Администратор выбирает пользователя для редактирования. Интерфейс запрашивает у сервера данные выбранного аккаунта, сервер возвращает данные, и интерфейс отображает данные пользователя (фамилию, имя, от</w:t>
+      </w:r>
+      <w:r>
+        <w:rPr>
+          <w:rFonts w:ascii="Times New Roman" w:eastAsia="Times New Roman" w:hAnsi="Times New Roman" w:cs="Times New Roman"/>
+          <w:sz w:val="28"/>
+          <w:szCs w:val="28"/>
+          <w:lang w:eastAsia="ru-RU"/>
+        </w:rPr>
+        <w:t>чество, почту, логин, телефон).</w:t>
+      </w:r>
+    </w:p>
+    <w:p>
+      <w:pPr>
+        <w:spacing w:after="0" w:line="360" w:lineRule="auto"/>
+        <w:ind w:firstLine="709"/>
+        <w:contextualSpacing/>
+        <w:jc w:val="both"/>
+        <w:rPr>
+          <w:rFonts w:ascii="Times New Roman" w:eastAsia="Times New Roman" w:hAnsi="Times New Roman" w:cs="Times New Roman"/>
+          <w:sz w:val="28"/>
+          <w:szCs w:val="28"/>
+          <w:lang w:eastAsia="ru-RU"/>
+        </w:rPr>
+      </w:pPr>
+      <w:r>
+        <w:rPr>
+          <w:rFonts w:ascii="Times New Roman" w:eastAsia="Times New Roman" w:hAnsi="Times New Roman" w:cs="Times New Roman"/>
+          <w:sz w:val="28"/>
+          <w:szCs w:val="28"/>
+          <w:lang w:eastAsia="ru-RU"/>
+        </w:rPr>
+        <w:lastRenderedPageBreak/>
+        <w:t>Администратор вводит новые данные и подтверждает изменения. Интерфейс передаёт обновлённые данные на сервер. Сервер выполняе</w:t>
+      </w:r>
+      <w:r>
+        <w:rPr>
+          <w:rFonts w:ascii="Times New Roman" w:eastAsia="Times New Roman" w:hAnsi="Times New Roman" w:cs="Times New Roman"/>
+          <w:sz w:val="28"/>
+          <w:szCs w:val="28"/>
+          <w:lang w:eastAsia="ru-RU"/>
+        </w:rPr>
+        <w:t>т проверку корректности данных.</w:t>
+      </w:r>
+    </w:p>
+    <w:p>
+      <w:pPr>
+        <w:spacing w:after="0" w:line="360" w:lineRule="auto"/>
+        <w:ind w:firstLine="709"/>
+        <w:contextualSpacing/>
+        <w:jc w:val="both"/>
+        <w:rPr>
+          <w:rFonts w:ascii="Times New Roman" w:eastAsia="Times New Roman" w:hAnsi="Times New Roman" w:cs="Times New Roman"/>
+          <w:sz w:val="28"/>
+          <w:szCs w:val="28"/>
+          <w:lang w:eastAsia="ru-RU"/>
+        </w:rPr>
+      </w:pPr>
+      <w:r>
+        <w:rPr>
+          <w:rFonts w:ascii="Times New Roman" w:eastAsia="Times New Roman" w:hAnsi="Times New Roman" w:cs="Times New Roman"/>
+          <w:sz w:val="28"/>
+          <w:szCs w:val="28"/>
+          <w:lang w:eastAsia="ru-RU"/>
+        </w:rPr>
+        <w:t xml:space="preserve">Если данные введены не корректно, сервер возвращает ошибку, интерфейс выводит сообщение об ошибке, и администратор </w:t>
+      </w:r>
+      <w:r>
+        <w:rPr>
+          <w:rFonts w:ascii="Times New Roman" w:eastAsia="Times New Roman" w:hAnsi="Times New Roman" w:cs="Times New Roman"/>
+          <w:sz w:val="28"/>
+          <w:szCs w:val="28"/>
+          <w:lang w:eastAsia="ru-RU"/>
+        </w:rPr>
+        <w:t>возвращается к вводу данных.</w:t>
+      </w:r>
+    </w:p>
+    <w:p>
+      <w:pPr>
+        <w:spacing w:after="0" w:line="360" w:lineRule="auto"/>
+        <w:ind w:firstLine="709"/>
+        <w:contextualSpacing/>
+        <w:jc w:val="both"/>
+        <w:rPr>
+          <w:rFonts w:ascii="Times New Roman" w:eastAsia="Times New Roman" w:hAnsi="Times New Roman" w:cs="Times New Roman"/>
+          <w:sz w:val="28"/>
+          <w:szCs w:val="28"/>
+          <w:lang w:eastAsia="ru-RU"/>
+        </w:rPr>
+      </w:pPr>
+      <w:r>
+        <w:rPr>
+          <w:rFonts w:ascii="Times New Roman" w:eastAsia="Times New Roman" w:hAnsi="Times New Roman" w:cs="Times New Roman"/>
+          <w:sz w:val="28"/>
+          <w:szCs w:val="28"/>
+          <w:lang w:eastAsia="ru-RU"/>
+        </w:rPr>
+        <w:t>Если данные корректны, сервер выполняет обновление данных в базе данных, после чего возвращает подтверждение успешного обновления. Интерфейс выводит сообщение</w:t>
+      </w:r>
+      <w:r>
+        <w:rPr>
+          <w:rFonts w:ascii="Times New Roman" w:eastAsia="Times New Roman" w:hAnsi="Times New Roman" w:cs="Times New Roman"/>
+          <w:sz w:val="28"/>
+          <w:szCs w:val="28"/>
+          <w:lang w:eastAsia="ru-RU"/>
+        </w:rPr>
+        <w:t xml:space="preserve"> об успешном обновлении данных.</w:t>
+      </w:r>
+    </w:p>
+    <w:p>
+      <w:pPr>
+        <w:spacing w:after="0" w:line="360" w:lineRule="auto"/>
+        <w:ind w:firstLine="709"/>
+        <w:contextualSpacing/>
+        <w:jc w:val="both"/>
+        <w:rPr>
+          <w:rFonts w:ascii="Times New Roman" w:eastAsia="Times New Roman" w:hAnsi="Times New Roman" w:cs="Times New Roman"/>
+          <w:sz w:val="28"/>
+          <w:szCs w:val="28"/>
+          <w:lang w:eastAsia="ru-RU"/>
+        </w:rPr>
+      </w:pPr>
+      <w:r>
+        <w:rPr>
+          <w:rFonts w:ascii="Times New Roman" w:eastAsia="Times New Roman" w:hAnsi="Times New Roman" w:cs="Times New Roman"/>
+          <w:sz w:val="28"/>
+          <w:szCs w:val="28"/>
+          <w:lang w:eastAsia="ru-RU"/>
+        </w:rPr>
+        <w:t>Завершающей точкой диаграммы является отображение сообщения об успешном обновлении данных пользователя при успешном изменении либо вывод с</w:t>
+      </w:r>
+      <w:r>
+        <w:rPr>
+          <w:rFonts w:ascii="Times New Roman" w:eastAsia="Times New Roman" w:hAnsi="Times New Roman" w:cs="Times New Roman"/>
+          <w:sz w:val="28"/>
+          <w:szCs w:val="28"/>
+          <w:lang w:eastAsia="ru-RU"/>
+        </w:rPr>
+        <w:t>ообщения об ошибке при неудаче.</w:t>
+      </w:r>
+    </w:p>
+    <w:p>
+      <w:pPr>
+        <w:spacing w:after="0" w:line="360" w:lineRule="auto"/>
+        <w:contextualSpacing/>
+        <w:jc w:val="center"/>
+        <w:rPr>
+          <w:rFonts w:ascii="Times New Roman" w:eastAsia="Times New Roman" w:hAnsi="Times New Roman" w:cs="Times New Roman"/>
+          <w:sz w:val="28"/>
+          <w:szCs w:val="28"/>
+          <w:lang w:eastAsia="ru-RU"/>
+        </w:rPr>
+      </w:pPr>
+      <w:r>
+        <w:rPr>
+          <w:rFonts w:ascii="Times New Roman" w:eastAsia="Times New Roman" w:hAnsi="Times New Roman" w:cs="Times New Roman"/>
+          <w:sz w:val="28"/>
+          <w:szCs w:val="28"/>
+          <w:lang w:eastAsia="ru-RU"/>
+        </w:rPr>
+        <w:lastRenderedPageBreak/>
+        <w:drawing>
+          <wp:inline distT="0" distB="0" distL="0" distR="0" wp14:anchorId="3D166DE3" wp14:editId="20827DAD">
+            <wp:extent cx="4191585" cy="8049748"/>
+            <wp:effectExtent l="0" t="0" r="0" b="8890"/>
+            <wp:docPr id="4" name="Рисунок 4"/>
+            <wp:cNvGraphicFramePr>
+              <a:graphicFrameLocks xmlns:a="http://schemas.openxmlformats.org/drawingml/2006/main" noChangeAspect="1"/>
+            </wp:cNvGraphicFramePr>
+            <a:graphic xmlns:a="http://schemas.openxmlformats.org/drawingml/2006/main">
+              <a:graphicData uri="http://schemas.openxmlformats.org/drawingml/2006/picture">
+                <pic:pic xmlns:pic="http://schemas.openxmlformats.org/drawingml/2006/picture">
+                  <pic:nvPicPr>
+                    <pic:cNvPr id="1" name=""/>
+                    <pic:cNvPicPr/>
+                  </pic:nvPicPr>
+                  <pic:blipFill>
+                    <a:blip r:embed="rId13"/>
+                    <a:stretch>
+                      <a:fillRect/>
+                    </a:stretch>
+                  </pic:blipFill>
+                  <pic:spPr>
+                    <a:xfrm>
+                      <a:off x="0" y="0"/>
+                      <a:ext cx="4191585" cy="8049748"/>
+                    </a:xfrm>
+                    <a:prstGeom prst="rect">
+                      <a:avLst/>
+                    </a:prstGeom>
+                  </pic:spPr>
+                </pic:pic>
+              </a:graphicData>
+            </a:graphic>
+          </wp:inline>
+        </w:drawing>
+      </w:r>
+    </w:p>
+    <w:p>
+      <w:pPr>
+        <w:spacing w:after="0" w:line="360" w:lineRule="auto"/>
+        <w:contextualSpacing/>
+        <w:jc w:val="center"/>
+        <w:rPr>
+          <w:rFonts w:ascii="Times New Roman" w:eastAsia="Times New Roman" w:hAnsi="Times New Roman" w:cs="Times New Roman"/>
+          <w:sz w:val="28"/>
+          <w:szCs w:val="28"/>
+          <w:lang w:eastAsia="ru-RU"/>
+        </w:rPr>
+      </w:pPr>
+      <w:r>
+        <w:rPr>
+          <w:rFonts w:ascii="Times New Roman" w:eastAsia="Times New Roman" w:hAnsi="Times New Roman" w:cs="Times New Roman"/>
+          <w:sz w:val="28"/>
+          <w:szCs w:val="28"/>
+          <w:lang w:eastAsia="ru-RU"/>
+        </w:rPr>
+        <w:t>Рисунок 6 – Диаграмма последовательности.</w:t>
+      </w:r>
+    </w:p>
+    <w:p>
+      <w:pPr>
+        <w:pStyle w:val="2"/>
+        <w:numPr>
+          <w:ilvl w:val="1"/>
+          <w:numId w:val="4"/>
+        </w:numPr>
+        <w:rPr>
+          <w:rFonts w:eastAsia="Times New Roman"/>
+          <w:lang w:eastAsia="ru-RU"/>
+        </w:rPr>
+      </w:pPr>
+      <w:r>
+        <w:rPr>
+          <w:rFonts w:eastAsia="Times New Roman"/>
+          <w:lang w:eastAsia="ru-RU"/>
+        </w:rPr>
+        <w:t>Диаграмма коммуникации</w:t>
+      </w:r>
+    </w:p>
+    <w:p>
+      <w:pPr>
+        <w:spacing w:after="0" w:line="360" w:lineRule="auto"/>
+        <w:ind w:firstLine="709"/>
+        <w:contextualSpacing/>
+        <w:jc w:val="both"/>
+        <w:rPr>
+          <w:rFonts w:ascii="Times New Roman" w:eastAsia="Times New Roman" w:hAnsi="Times New Roman" w:cs="Times New Roman"/>
+          <w:sz w:val="28"/>
+          <w:szCs w:val="28"/>
+          <w:lang w:eastAsia="ru-RU"/>
+        </w:rPr>
+      </w:pPr>
       <w:bookmarkStart w:id="22" w:name="_GoBack"/>
       <w:bookmarkEnd w:id="22"/>
-    </w:p>
-    <w:p>
-      <w:pPr>
-        <w:spacing w:after="0" w:line="360" w:lineRule="auto"/>
-        <w:ind w:firstLine="709"/>
-        <w:contextualSpacing/>
-        <w:jc w:val="both"/>
-        <w:rPr>
-          <w:rFonts w:ascii="Times New Roman" w:eastAsia="Times New Roman" w:hAnsi="Times New Roman" w:cs="Times New Roman"/>
-          <w:sz w:val="28"/>
-          <w:szCs w:val="28"/>
-          <w:lang w:eastAsia="ru-RU"/>
-        </w:rPr>
-      </w:pPr>
-    </w:p>
-    <w:p>
-      <w:pPr>
-        <w:spacing w:after="0" w:line="360" w:lineRule="auto"/>
-        <w:ind w:firstLine="709"/>
-        <w:contextualSpacing/>
-        <w:jc w:val="both"/>
-        <w:rPr>
-          <w:rFonts w:ascii="Times New Roman" w:eastAsia="Times New Roman" w:hAnsi="Times New Roman" w:cs="Times New Roman"/>
-          <w:sz w:val="28"/>
-          <w:szCs w:val="28"/>
-          <w:lang w:eastAsia="ru-RU"/>
-        </w:rPr>
-      </w:pPr>
-    </w:p>
-    <w:p>
-      <w:pPr>
-        <w:spacing w:after="0" w:line="360" w:lineRule="auto"/>
-        <w:ind w:firstLine="709"/>
-        <w:contextualSpacing/>
-        <w:jc w:val="both"/>
-        <w:rPr>
-          <w:rFonts w:ascii="Times New Roman" w:eastAsia="Times New Roman" w:hAnsi="Times New Roman" w:cs="Times New Roman"/>
-          <w:sz w:val="28"/>
-          <w:szCs w:val="28"/>
-          <w:lang w:eastAsia="ru-RU"/>
-        </w:rPr>
-      </w:pPr>
     </w:p>
     <w:p>
       <w:pPr>
@@ -13609,7 +14121,7 @@
       </w:pPr>
     </w:p>
     <w:sectPr>
-      <w:footerReference w:type="default" r:id="rId13"/>
+      <w:footerReference w:type="default" r:id="rId14"/>
       <w:pgSz w:w="11906" w:h="16838"/>
       <w:pgMar w:top="1134" w:right="851" w:bottom="1134" w:left="1701" w:header="709" w:footer="709" w:gutter="0"/>
       <w:pgNumType w:start="0"/>
@@ -13675,7 +14187,7 @@
           <w:rPr>
             <w:noProof/>
           </w:rPr>
-          <w:t>24</w:t>
+          <w:t>28</w:t>
         </w:r>
         <w:r>
           <w:fldChar w:fldCharType="end"/>
@@ -18005,7 +18517,7 @@
 </file>
 
 <file path=customXml/itemProps1.xml><?xml version="1.0" encoding="utf-8"?>
-<ds:datastoreItem xmlns:ds="http://schemas.openxmlformats.org/officeDocument/2006/customXml" ds:itemID="{8B00DCA8-79F4-4921-8754-8F3E47136A8E}">
+<ds:datastoreItem xmlns:ds="http://schemas.openxmlformats.org/officeDocument/2006/customXml" ds:itemID="{398526E2-35E5-4D4E-8B03-D0FA6A6ED89C}">
   <ds:schemaRefs>
     <ds:schemaRef ds:uri="http://schemas.openxmlformats.org/officeDocument/2006/bibliography"/>
   </ds:schemaRefs>

</xml_diff>